<commit_message>
Correct developer draft claims and test the actual document example
</commit_message>
<xml_diff>
--- a/docs/presentation/nanolang-developer-overview.docx
+++ b/docs/presentation/nanolang-developer-overview.docx
@@ -28,7 +28,7 @@
           <w:color w:val="101317"/>
           <w:sz w:val="22"/>
         </w:rPr>
-        <w:t>I am NanoLang. This is my developer narrative for release 4.5. It explains my language contract, compiler paths, NanoISA bytecode, NanoVM execution, foreign-function boundary, Nano Service Interface, POSIX capability fabric, trap journal, tests, diagnostics, and the work I have not done. I am a language and a secure runtime. I do not claim a kernel.</w:t>
+        <w:t>I am NanoLang. This is my unpublished 5.0 development draft, not a release-readiness claim. It explains my language contract, compiler paths, NanoISA bytecode, NanoVM execution, foreign-function boundary, Nano Service Interface, POSIX capability fabric, trap journal, tests, diagnostics, and unfinished work. My runtime foundations are under development. Laboratory service tests do not establish production isolation. I do not claim a kernel.</w:t>
       </w:r>
     </w:p>
     <w:p>
@@ -106,7 +106,9 @@
         </w:rPr>
         <w:t>fn gcd(a: int, b: int) -&gt; int {</w:t>
         <w:br/>
-        <w:t xml:space="preserve">    return a</w:t>
+        <w:t xml:space="preserve">    if (== b 0) { return a }</w:t>
+        <w:br/>
+        <w:t xml:space="preserve">    return (gcd b (% a b))</w:t>
         <w:br/>
         <w:t>}</w:t>
         <w:br/>
@@ -115,7 +117,24 @@
         <w:br/>
         <w:t xml:space="preserve">    assert (== (gcd 48 18) 6)</w:t>
         <w:br/>
+        <w:t xml:space="preserve">    assert (== (gcd 18 0) 18)</w:t>
+        <w:br/>
+        <w:t xml:space="preserve">    assert (== (gcd 0 0) 0)</w:t>
+        <w:br/>
         <w:t>}</w:t>
+      </w:r>
+    </w:p>
+    <w:p>
+      <w:pPr>
+        <w:spacing w:after="160" w:line="240" w:lineRule="auto"/>
+      </w:pPr>
+      <w:r>
+        <w:rPr>
+          <w:rFonts w:ascii="Calibri" w:hAnsi="Calibri"/>
+          <w:color w:val="101317"/>
+          <w:sz w:val="22"/>
+        </w:rPr>
+        <w:t>This example checks selected nonnegative and zero inputs. It is not a theorem for every integer.</w:t>
       </w:r>
     </w:p>
     <w:p>
@@ -136,7 +155,20 @@
           <w:color w:val="101317"/>
           <w:sz w:val="22"/>
         </w:rPr>
-        <w:t>Every eligible function carries a shadow test. The test is an executable statement about behavior. It is not a coverage decoration and it is not a substitute for integration tests.</w:t>
+        <w:t>My project policy requires useful shadows. My compiler currently warns about missing tests, with exemptions documented in docs/CANONICAL_STYLE.md. A shadow checks its assertions; it does not prove every input or replace integration tests.</w:t>
+      </w:r>
+    </w:p>
+    <w:p>
+      <w:pPr>
+        <w:spacing w:after="160" w:line="240" w:lineRule="auto"/>
+      </w:pPr>
+      <w:r>
+        <w:rPr>
+          <w:rFonts w:ascii="Calibri" w:hAnsi="Calibri"/>
+          <w:color w:val="101317"/>
+          <w:sz w:val="22"/>
+        </w:rPr>
+        <w:t>My C seed, self-hosted native driver, and bytecode CLI select root and transitive dependency shadows by default, with an explicit root-only opt-out. They run tests in separate processes under parent deadlines before publishing output. This is not a security sandbox. Source-only C emission does not execute tests.</w:t>
       </w:r>
     </w:p>
     <w:p>
@@ -157,7 +189,7 @@
           <w:color w:val="101317"/>
           <w:sz w:val="22"/>
         </w:rPr>
-        <w:t>My NanoCore semantics have mechanized proofs for preservation, progress, determinism, semantic equivalence, and evaluator soundness. Full NanoLang, NanoISA, FFI, NSI, and generated-C behavior remains outside that proved subset unless explicitly stated otherwise.</w:t>
+        <w:t>My NanoCore model states mechanized proofs for preservation, progress, determinism, semantic equivalence, and evaluator soundness under the hypotheses in formal/README.md and the theorem statements. These do not establish correspondence with my production parser, typechecker, compilers, NanoVM, FFI, NSI, or host. That correspondence requires separate evidence.</w:t>
       </w:r>
     </w:p>
     <w:p>
@@ -186,7 +218,7 @@
           <w:color w:val="101317"/>
           <w:sz w:val="22"/>
         </w:rPr>
-        <w:t>nanoc lowers NanoLang to generated C and links the runtime libraries. This is my native production path. The generated program carries the behavior of the source only after compilation and its tests pass.</w:t>
+        <w:t>nanoc lowers NanoLang to generated C and links the runtime libraries. This is my native execution path. Passing compilation and tests supplies evidence for the cases checked, not semantic equivalence. Full backend parity remains roadmap work.</w:t>
       </w:r>
     </w:p>
     <w:p>
@@ -296,6 +328,19 @@
     </w:p>
     <w:p>
       <w:pPr>
+        <w:spacing w:after="160" w:line="240" w:lineRule="auto"/>
+      </w:pPr>
+      <w:r>
+        <w:rPr>
+          <w:rFonts w:ascii="Calibri" w:hAnsi="Calibri"/>
+          <w:color w:val="101317"/>
+          <w:sz w:val="22"/>
+        </w:rPr>
+        <w:t>My verifier tracks an abstract balance of explicit retain/release instructions, not object identity or complete source ownership. Tested cycle collection is not complete leak freedom. Unknown operand types are not proved safe.</w:t>
+      </w:r>
+    </w:p>
+    <w:p>
+      <w:pPr>
         <w:pStyle w:val="Heading2"/>
       </w:pPr>
       <w:r>
@@ -349,7 +394,7 @@
         <w:pStyle w:val="Heading2"/>
       </w:pPr>
       <w:r>
-        <w:t>Tests</w:t>
+        <w:t>Unit, integration, and shadow tests</w:t>
       </w:r>
     </w:p>
     <w:p>
@@ -362,7 +407,7 @@
           <w:color w:val="101317"/>
           <w:sz w:val="22"/>
         </w:rPr>
-        <w:t>4.0 counted 2,632 NanoISA tests, 621 NanoVM tests, 63 NanoVirt tests, and 93 verifier tests at the v4.0.0 tag. 4.1–4.5 add NSI, fabric, catalog, Forth, nano_emacs_worker, policy, journal, and observability suites on top of that. CI exercises x64, arm64, sanitizers, coverage, documentation, benchmarks, and security checks.</w:t>
+        <w:t>4.0 counted 2,632 NanoISA tests, 621 NanoVM tests, 63 NanoVirt tests, and 93 verifier tests at the v4.0.0 tag. 4.1–4.5 added NSI, fabric, catalog, Forth, nano_emacs_worker, policy, journal, and observability suites. These are historical counts, not fresh results for this draft. Configured CI workflows and local passing gates are distinct evidence; neither implies that every hosted check ran for this revision.</w:t>
       </w:r>
     </w:p>
     <w:p>
@@ -433,7 +478,7 @@
           <w:color w:val="101317"/>
           <w:sz w:val="22"/>
         </w:rPr>
-        <w:t>I shipped NanoISA v2 and NanoVM v2: a regular portable instruction set, a v2 module format, stack and type verification, return-shape and ownership checks, fuzzed parsing surfaces, cycle collection, and measured dispatch. See docs/RELEASE_4.0.md.</w:t>
+        <w:t>My historical 4.0 release shipped NanoISA v2 and NanoVM v2: a regular portable instruction set, a v2 module format, modeled stack and type checks, return-shape and abstract retain/release checks, parser tests, cycle collection, and measured dispatch. See docs/RELEASE_4.0.md. This is not a whole-program safety proof.</w:t>
       </w:r>
     </w:p>
     <w:p>
@@ -546,7 +591,7 @@
           <w:color w:val="101317"/>
           <w:sz w:val="22"/>
         </w:rPr>
-        <w:t>NSI v0 is a fail-closed document of ids, payloads, and compatibility. Generators emit NanoLang, Forth, Python, Rust, and C++ stubs. Unforgeable NlCap tokens, capability-scoped shared memory, and a POSIX supervisor host services on an ordinary kernel. I do not claim a kernel, or a CUDA or CPython wrap. Authority: docs/NSI.md, docs/NSI_FABRIC.md, docs/NSI_TCB.md.</w:t>
+        <w:t>NSI v0 specifies ids, payloads, and compatibility with fail-closed checks. Generators emit NanoLang, Forth, Python, Rust, and C++ stubs. Checked capability APIs, shared memory, and a POSIX supervisor provide runtime foundations on an ordinary kernel. Laboratory tests do not establish unforgeability against a hostile process or production isolation. I do not claim a kernel, or a CUDA or CPython wrap. Authority: docs/NSI.md, docs/NSI_FABRIC.md, docs/NSI_TCB.md.</w:t>
       </w:r>
     </w:p>
     <w:p>
@@ -588,7 +633,7 @@
           <w:color w:val="101317"/>
           <w:sz w:val="22"/>
         </w:rPr>
-        <w:t>schema/nsi/effect_map.v0.json maps source effects, NanoISA traps, NSI methods, and capabilities. I emit an inventory, generate a deployment manifest, and reject uncovered grants. A versioned journal records trap-boundary events and replays the recorded result without calling the original service. HMAC-SHA256 authenticates a journal with a deployment key; that is not PKI. Checkpoints are sequence numbers, not heap snapshots. The journal is a tested C library in this tag and is not hooked into every vm.c trap. Authority: docs/NSI_EFFECTS.md.</w:t>
+        <w:t>schema/nsi/effect_map.v0.json maps source effects, NanoISA traps, NSI methods, and capabilities. I emit an inventory, generate a deployment manifest, and reject uncovered grants. A versioned journal records trap-boundary events and replays the recorded result without calling the original service. HMAC-SHA256 authenticates a journal with a deployment key; that is not PKI. Checkpoints are sequence numbers, not heap snapshots. The journal is a tested C library, not a hook on every vm.c trap. Authority: docs/NSI_EFFECTS.md.</w:t>
       </w:r>
     </w:p>
     <w:p>
@@ -609,7 +654,20 @@
           <w:color w:val="101317"/>
           <w:sz w:val="22"/>
         </w:rPr>
-        <w:t>I have not claimed a Forth Standard System, reviewed human translations, GNU Emacs compatibility, a kernel, CUDA or CPython as wrapped runtimes, Makefile header dependencies (GitHub issue #211), or the 5.0 one-IR rewrite. See docs/RELEASE_4.5.md and docs/ROADMAP.md.</w:t>
+        <w:t>I have not completed a Forth Standard System, reviewed human translations, GNU Emacs compatibility, a kernel, CUDA or CPython as wrapped runtimes, full backend parity, complete ownership analysis, production service isolation, or the 5.0 one-IR work. See docs/ROADMAP.md; historical release scope is in docs/RELEASE_4.5.md.</w:t>
+      </w:r>
+    </w:p>
+    <w:p>
+      <w:pPr>
+        <w:spacing w:after="160" w:line="240" w:lineRule="auto"/>
+      </w:pPr>
+      <w:r>
+        <w:rPr>
+          <w:rFonts w:ascii="Calibri" w:hAnsi="Calibri"/>
+          <w:color w:val="101317"/>
+          <w:sz w:val="22"/>
+        </w:rPr>
+        <w:t>I have implemented transitive C header dependencies in Makefile.gnu, resolving the implementation gap recorded as GitHub issue #211. The focused gate is make test-make-header-dependencies. Broader native-cache snapshot and publication requirements remain separate work.</w:t>
       </w:r>
     </w:p>
     <w:p>

</xml_diff>

<commit_message>
Complete document visual acceptance and keep command blocks intact
</commit_message>
<xml_diff>
--- a/docs/presentation/nanolang-developer-overview.docx
+++ b/docs/presentation/nanolang-developer-overview.docx
@@ -20,6 +20,7 @@
     </w:p>
     <w:p>
       <w:pPr>
+        <w:keepLines w:val="0"/>
         <w:spacing w:after="160" w:line="240" w:lineRule="auto"/>
       </w:pPr>
       <w:r>
@@ -33,6 +34,7 @@
     </w:p>
     <w:p>
       <w:pPr>
+        <w:keepLines w:val="0"/>
         <w:spacing w:after="160" w:line="240" w:lineRule="auto"/>
       </w:pPr>
       <w:r>
@@ -54,6 +56,7 @@
     </w:p>
     <w:p>
       <w:pPr>
+        <w:keepLines w:val="0"/>
         <w:spacing w:after="160" w:line="240" w:lineRule="auto"/>
       </w:pPr>
       <w:r>
@@ -83,6 +86,7 @@
     </w:p>
     <w:p>
       <w:pPr>
+        <w:keepLines w:val="0"/>
         <w:spacing w:after="160" w:line="240" w:lineRule="auto"/>
       </w:pPr>
       <w:r>
@@ -96,6 +100,7 @@
     </w:p>
     <w:p>
       <w:pPr>
+        <w:keepLines/>
         <w:spacing w:after="160" w:line="240" w:lineRule="auto"/>
       </w:pPr>
       <w:r>
@@ -126,6 +131,7 @@
     </w:p>
     <w:p>
       <w:pPr>
+        <w:keepLines w:val="0"/>
         <w:spacing w:after="160" w:line="240" w:lineRule="auto"/>
       </w:pPr>
       <w:r>
@@ -147,6 +153,7 @@
     </w:p>
     <w:p>
       <w:pPr>
+        <w:keepLines w:val="0"/>
         <w:spacing w:after="160" w:line="240" w:lineRule="auto"/>
       </w:pPr>
       <w:r>
@@ -160,6 +167,7 @@
     </w:p>
     <w:p>
       <w:pPr>
+        <w:keepLines w:val="0"/>
         <w:spacing w:after="160" w:line="240" w:lineRule="auto"/>
       </w:pPr>
       <w:r>
@@ -181,6 +189,7 @@
     </w:p>
     <w:p>
       <w:pPr>
+        <w:keepLines w:val="0"/>
         <w:spacing w:after="160" w:line="240" w:lineRule="auto"/>
       </w:pPr>
       <w:r>
@@ -210,6 +219,7 @@
     </w:p>
     <w:p>
       <w:pPr>
+        <w:keepLines w:val="0"/>
         <w:spacing w:after="160" w:line="240" w:lineRule="auto"/>
       </w:pPr>
       <w:r>
@@ -231,6 +241,7 @@
     </w:p>
     <w:p>
       <w:pPr>
+        <w:keepLines w:val="0"/>
         <w:spacing w:after="160" w:line="240" w:lineRule="auto"/>
       </w:pPr>
       <w:r>
@@ -244,6 +255,7 @@
     </w:p>
     <w:p>
       <w:pPr>
+        <w:keepLines/>
         <w:spacing w:after="160" w:line="240" w:lineRule="auto"/>
       </w:pPr>
       <w:r>
@@ -265,6 +277,7 @@
     </w:p>
     <w:p>
       <w:pPr>
+        <w:keepLines w:val="0"/>
         <w:spacing w:after="160" w:line="240" w:lineRule="auto"/>
       </w:pPr>
       <w:r>
@@ -286,6 +299,7 @@
     </w:p>
     <w:p>
       <w:pPr>
+        <w:keepLines w:val="0"/>
         <w:spacing w:after="160" w:line="240" w:lineRule="auto"/>
       </w:pPr>
       <w:r>
@@ -315,6 +329,7 @@
     </w:p>
     <w:p>
       <w:pPr>
+        <w:keepLines w:val="0"/>
         <w:spacing w:after="160" w:line="240" w:lineRule="auto"/>
       </w:pPr>
       <w:r>
@@ -328,6 +343,7 @@
     </w:p>
     <w:p>
       <w:pPr>
+        <w:keepLines w:val="0"/>
         <w:spacing w:after="160" w:line="240" w:lineRule="auto"/>
       </w:pPr>
       <w:r>
@@ -349,6 +365,7 @@
     </w:p>
     <w:p>
       <w:pPr>
+        <w:keepLines w:val="0"/>
         <w:spacing w:after="160" w:line="240" w:lineRule="auto"/>
       </w:pPr>
       <w:r>
@@ -370,6 +387,7 @@
     </w:p>
     <w:p>
       <w:pPr>
+        <w:keepLines w:val="0"/>
         <w:spacing w:after="160" w:line="240" w:lineRule="auto"/>
       </w:pPr>
       <w:r>
@@ -399,6 +417,7 @@
     </w:p>
     <w:p>
       <w:pPr>
+        <w:keepLines w:val="0"/>
         <w:spacing w:after="160" w:line="240" w:lineRule="auto"/>
       </w:pPr>
       <w:r>
@@ -420,6 +439,7 @@
     </w:p>
     <w:p>
       <w:pPr>
+        <w:keepLines w:val="0"/>
         <w:spacing w:after="160" w:line="240" w:lineRule="auto"/>
       </w:pPr>
       <w:r>
@@ -441,6 +461,7 @@
     </w:p>
     <w:p>
       <w:pPr>
+        <w:keepLines w:val="0"/>
         <w:spacing w:after="160" w:line="240" w:lineRule="auto"/>
       </w:pPr>
       <w:r>
@@ -470,6 +491,7 @@
     </w:p>
     <w:p>
       <w:pPr>
+        <w:keepLines w:val="0"/>
         <w:spacing w:after="160" w:line="240" w:lineRule="auto"/>
       </w:pPr>
       <w:r>
@@ -491,6 +513,7 @@
     </w:p>
     <w:p>
       <w:pPr>
+        <w:keepLines w:val="0"/>
         <w:spacing w:after="160" w:line="240" w:lineRule="auto"/>
       </w:pPr>
       <w:r>
@@ -512,6 +535,7 @@
     </w:p>
     <w:p>
       <w:pPr>
+        <w:keepLines w:val="0"/>
         <w:spacing w:after="160" w:line="240" w:lineRule="auto"/>
       </w:pPr>
       <w:r>
@@ -541,6 +565,7 @@
     </w:p>
     <w:p>
       <w:pPr>
+        <w:keepLines w:val="0"/>
         <w:spacing w:after="160" w:line="240" w:lineRule="auto"/>
       </w:pPr>
       <w:r>
@@ -562,6 +587,7 @@
     </w:p>
     <w:p>
       <w:pPr>
+        <w:keepLines w:val="0"/>
         <w:spacing w:after="160" w:line="240" w:lineRule="auto"/>
       </w:pPr>
       <w:r>
@@ -583,6 +609,7 @@
     </w:p>
     <w:p>
       <w:pPr>
+        <w:keepLines w:val="0"/>
         <w:spacing w:after="160" w:line="240" w:lineRule="auto"/>
       </w:pPr>
       <w:r>
@@ -604,6 +631,7 @@
     </w:p>
     <w:p>
       <w:pPr>
+        <w:keepLines w:val="0"/>
         <w:spacing w:after="160" w:line="240" w:lineRule="auto"/>
       </w:pPr>
       <w:r>
@@ -625,6 +653,7 @@
     </w:p>
     <w:p>
       <w:pPr>
+        <w:keepLines w:val="0"/>
         <w:spacing w:after="160" w:line="240" w:lineRule="auto"/>
       </w:pPr>
       <w:r>
@@ -646,6 +675,7 @@
     </w:p>
     <w:p>
       <w:pPr>
+        <w:keepLines w:val="0"/>
         <w:spacing w:after="160" w:line="240" w:lineRule="auto"/>
       </w:pPr>
       <w:r>
@@ -659,6 +689,7 @@
     </w:p>
     <w:p>
       <w:pPr>
+        <w:keepLines w:val="0"/>
         <w:spacing w:after="160" w:line="240" w:lineRule="auto"/>
       </w:pPr>
       <w:r>
@@ -668,6 +699,11 @@
           <w:sz w:val="22"/>
         </w:rPr>
         <w:t>I have implemented transitive C header dependencies in Makefile.gnu, resolving the implementation gap recorded as GitHub issue #211. The focused gate is make test-make-header-dependencies. Broader native-cache snapshot and publication requirements remain separate work.</w:t>
+      </w:r>
+    </w:p>
+    <w:p>
+      <w:r>
+        <w:br w:type="page"/>
       </w:r>
     </w:p>
     <w:p>
@@ -688,6 +724,7 @@
     </w:p>
     <w:p>
       <w:pPr>
+        <w:keepLines w:val="0"/>
         <w:spacing w:after="160" w:line="240" w:lineRule="auto"/>
       </w:pPr>
       <w:r>
@@ -709,6 +746,7 @@
     </w:p>
     <w:p>
       <w:pPr>
+        <w:keepLines/>
         <w:spacing w:after="160" w:line="240" w:lineRule="auto"/>
       </w:pPr>
       <w:r>
@@ -728,6 +766,7 @@
     </w:p>
     <w:p>
       <w:pPr>
+        <w:keepLines w:val="0"/>
         <w:spacing w:after="160" w:line="240" w:lineRule="auto"/>
       </w:pPr>
       <w:r>

</xml_diff>

<commit_message>
MAC task task_92e6817607cf4071ab614289911a9a41: Retain assembler include-search inputs in module builds
</commit_message>
<xml_diff>
--- a/docs/presentation/nanolang-developer-overview.docx
+++ b/docs/presentation/nanolang-developer-overview.docx
@@ -20,6 +20,7 @@
     </w:p>
     <w:p>
       <w:pPr>
+        <w:keepLines w:val="0"/>
         <w:spacing w:after="160" w:line="240" w:lineRule="auto"/>
       </w:pPr>
       <w:r>
@@ -28,11 +29,12 @@
           <w:color w:val="101317"/>
           <w:sz w:val="22"/>
         </w:rPr>
-        <w:t>I am NanoLang. This is my developer narrative for release 4.5. It explains my language contract, compiler paths, NanoISA bytecode, NanoVM execution, foreign-function boundary, Nano Service Interface, POSIX capability fabric, trap journal, tests, diagnostics, and the work I have not done. I am a language and a secure runtime. I do not claim a kernel.</w:t>
+        <w:t>I am NanoLang. This is my unpublished 5.0 development draft, not a release-readiness claim. It explains my language contract, compiler paths, NanoISA bytecode, NanoVM execution, foreign-function boundary, Nano Service Interface, POSIX capability fabric, trap journal, tests, diagnostics, and unfinished work. My runtime foundations are under development. Laboratory service tests do not establish production isolation. I do not claim a kernel.</w:t>
       </w:r>
     </w:p>
     <w:p>
       <w:pPr>
+        <w:keepLines w:val="0"/>
         <w:spacing w:after="160" w:line="240" w:lineRule="auto"/>
       </w:pPr>
       <w:r>
@@ -54,6 +56,7 @@
     </w:p>
     <w:p>
       <w:pPr>
+        <w:keepLines w:val="0"/>
         <w:spacing w:after="160" w:line="240" w:lineRule="auto"/>
       </w:pPr>
       <w:r>
@@ -83,6 +86,7 @@
     </w:p>
     <w:p>
       <w:pPr>
+        <w:keepLines w:val="0"/>
         <w:spacing w:after="160" w:line="240" w:lineRule="auto"/>
       </w:pPr>
       <w:r>
@@ -96,6 +100,7 @@
     </w:p>
     <w:p>
       <w:pPr>
+        <w:keepLines/>
         <w:spacing w:after="160" w:line="240" w:lineRule="auto"/>
       </w:pPr>
       <w:r>
@@ -106,7 +111,9 @@
         </w:rPr>
         <w:t>fn gcd(a: int, b: int) -&gt; int {</w:t>
         <w:br/>
-        <w:t xml:space="preserve">    return a</w:t>
+        <w:t xml:space="preserve">    if (== b 0) { return a }</w:t>
+        <w:br/>
+        <w:t xml:space="preserve">    return (gcd b (% a b))</w:t>
         <w:br/>
         <w:t>}</w:t>
         <w:br/>
@@ -115,7 +122,25 @@
         <w:br/>
         <w:t xml:space="preserve">    assert (== (gcd 48 18) 6)</w:t>
         <w:br/>
+        <w:t xml:space="preserve">    assert (== (gcd 18 0) 18)</w:t>
+        <w:br/>
+        <w:t xml:space="preserve">    assert (== (gcd 0 0) 0)</w:t>
+        <w:br/>
         <w:t>}</w:t>
+      </w:r>
+    </w:p>
+    <w:p>
+      <w:pPr>
+        <w:keepLines w:val="0"/>
+        <w:spacing w:after="160" w:line="240" w:lineRule="auto"/>
+      </w:pPr>
+      <w:r>
+        <w:rPr>
+          <w:rFonts w:ascii="Calibri" w:hAnsi="Calibri"/>
+          <w:color w:val="101317"/>
+          <w:sz w:val="22"/>
+        </w:rPr>
+        <w:t>This example checks selected nonnegative and zero inputs. It is not a theorem for every integer.</w:t>
       </w:r>
     </w:p>
     <w:p>
@@ -128,6 +153,7 @@
     </w:p>
     <w:p>
       <w:pPr>
+        <w:keepLines w:val="0"/>
         <w:spacing w:after="160" w:line="240" w:lineRule="auto"/>
       </w:pPr>
       <w:r>
@@ -136,7 +162,21 @@
           <w:color w:val="101317"/>
           <w:sz w:val="22"/>
         </w:rPr>
-        <w:t>Every eligible function carries a shadow test. The test is an executable statement about behavior. It is not a coverage decoration and it is not a substitute for integration tests.</w:t>
+        <w:t>My project policy requires useful shadows. My compiler currently warns about missing tests, with exemptions documented in docs/CANONICAL_STYLE.md. A shadow checks its assertions; it does not prove every input or replace integration tests.</w:t>
+      </w:r>
+    </w:p>
+    <w:p>
+      <w:pPr>
+        <w:keepLines w:val="0"/>
+        <w:spacing w:after="160" w:line="240" w:lineRule="auto"/>
+      </w:pPr>
+      <w:r>
+        <w:rPr>
+          <w:rFonts w:ascii="Calibri" w:hAnsi="Calibri"/>
+          <w:color w:val="101317"/>
+          <w:sz w:val="22"/>
+        </w:rPr>
+        <w:t>My C seed, self-hosted native driver, and bytecode CLI select root and transitive dependency shadows by default, with an explicit root-only opt-out. They run tests in separate processes under parent deadlines before publishing output. This is not a security sandbox. Source-only C emission does not execute tests.</w:t>
       </w:r>
     </w:p>
     <w:p>
@@ -149,6 +189,7 @@
     </w:p>
     <w:p>
       <w:pPr>
+        <w:keepLines w:val="0"/>
         <w:spacing w:after="160" w:line="240" w:lineRule="auto"/>
       </w:pPr>
       <w:r>
@@ -157,7 +198,7 @@
           <w:color w:val="101317"/>
           <w:sz w:val="22"/>
         </w:rPr>
-        <w:t>My NanoCore semantics have mechanized proofs for preservation, progress, determinism, semantic equivalence, and evaluator soundness. Full NanoLang, NanoISA, FFI, NSI, and generated-C behavior remains outside that proved subset unless explicitly stated otherwise.</w:t>
+        <w:t>My NanoCore model states mechanized proofs for preservation, progress, determinism, semantic equivalence, and evaluator soundness under the hypotheses in formal/README.md and the theorem statements. These do not establish correspondence with my production parser, typechecker, compilers, NanoVM, FFI, NSI, or host. That correspondence requires separate evidence.</w:t>
       </w:r>
     </w:p>
     <w:p>
@@ -178,6 +219,7 @@
     </w:p>
     <w:p>
       <w:pPr>
+        <w:keepLines w:val="0"/>
         <w:spacing w:after="160" w:line="240" w:lineRule="auto"/>
       </w:pPr>
       <w:r>
@@ -186,7 +228,7 @@
           <w:color w:val="101317"/>
           <w:sz w:val="22"/>
         </w:rPr>
-        <w:t>nanoc lowers NanoLang to generated C and links the runtime libraries. This is my native production path. The generated program carries the behavior of the source only after compilation and its tests pass.</w:t>
+        <w:t>nanoc lowers NanoLang to generated C and links the runtime libraries. This is my native execution path. Passing compilation and tests supplies evidence for the cases checked, not semantic equivalence. Full backend parity remains roadmap work.</w:t>
       </w:r>
     </w:p>
     <w:p>
@@ -199,6 +241,7 @@
     </w:p>
     <w:p>
       <w:pPr>
+        <w:keepLines w:val="0"/>
         <w:spacing w:after="160" w:line="240" w:lineRule="auto"/>
       </w:pPr>
       <w:r>
@@ -212,6 +255,7 @@
     </w:p>
     <w:p>
       <w:pPr>
+        <w:keepLines/>
         <w:spacing w:after="160" w:line="240" w:lineRule="auto"/>
       </w:pPr>
       <w:r>
@@ -233,6 +277,7 @@
     </w:p>
     <w:p>
       <w:pPr>
+        <w:keepLines w:val="0"/>
         <w:spacing w:after="160" w:line="240" w:lineRule="auto"/>
       </w:pPr>
       <w:r>
@@ -254,6 +299,7 @@
     </w:p>
     <w:p>
       <w:pPr>
+        <w:keepLines w:val="0"/>
         <w:spacing w:after="160" w:line="240" w:lineRule="auto"/>
       </w:pPr>
       <w:r>
@@ -283,6 +329,7 @@
     </w:p>
     <w:p>
       <w:pPr>
+        <w:keepLines w:val="0"/>
         <w:spacing w:after="160" w:line="240" w:lineRule="auto"/>
       </w:pPr>
       <w:r>
@@ -296,6 +343,20 @@
     </w:p>
     <w:p>
       <w:pPr>
+        <w:keepLines w:val="0"/>
+        <w:spacing w:after="160" w:line="240" w:lineRule="auto"/>
+      </w:pPr>
+      <w:r>
+        <w:rPr>
+          <w:rFonts w:ascii="Calibri" w:hAnsi="Calibri"/>
+          <w:color w:val="101317"/>
+          <w:sz w:val="22"/>
+        </w:rPr>
+        <w:t>My verifier tracks an abstract balance of explicit retain/release instructions, not object identity or complete source ownership. Tested cycle collection is not complete leak freedom. Unknown operand types are not proved safe.</w:t>
+      </w:r>
+    </w:p>
+    <w:p>
+      <w:pPr>
         <w:pStyle w:val="Heading2"/>
       </w:pPr>
       <w:r>
@@ -304,6 +365,7 @@
     </w:p>
     <w:p>
       <w:pPr>
+        <w:keepLines w:val="0"/>
         <w:spacing w:after="160" w:line="240" w:lineRule="auto"/>
       </w:pPr>
       <w:r>
@@ -325,6 +387,7 @@
     </w:p>
     <w:p>
       <w:pPr>
+        <w:keepLines w:val="0"/>
         <w:spacing w:after="160" w:line="240" w:lineRule="auto"/>
       </w:pPr>
       <w:r>
@@ -349,11 +412,12 @@
         <w:pStyle w:val="Heading2"/>
       </w:pPr>
       <w:r>
-        <w:t>Tests</w:t>
+        <w:t>Unit, integration, and shadow tests</w:t>
       </w:r>
     </w:p>
     <w:p>
       <w:pPr>
+        <w:keepLines w:val="0"/>
         <w:spacing w:after="160" w:line="240" w:lineRule="auto"/>
       </w:pPr>
       <w:r>
@@ -362,7 +426,7 @@
           <w:color w:val="101317"/>
           <w:sz w:val="22"/>
         </w:rPr>
-        <w:t>4.0 counted 2,632 NanoISA tests, 621 NanoVM tests, 63 NanoVirt tests, and 93 verifier tests at the v4.0.0 tag. 4.1–4.5 add NSI, fabric, catalog, Forth, nano_emacs_worker, policy, journal, and observability suites on top of that. CI exercises x64, arm64, sanitizers, coverage, documentation, benchmarks, and security checks.</w:t>
+        <w:t>4.0 counted 2,632 NanoISA tests, 621 NanoVM tests, 63 NanoVirt tests, and 93 verifier tests at the v4.0.0 tag. 4.1–4.5 added NSI, fabric, catalog, Forth, nano_emacs_worker, policy, journal, and observability suites. These are historical counts, not fresh results for this draft. Configured CI workflows and local passing gates are distinct evidence; neither implies that every hosted check ran for this revision.</w:t>
       </w:r>
     </w:p>
     <w:p>
@@ -375,6 +439,7 @@
     </w:p>
     <w:p>
       <w:pPr>
+        <w:keepLines w:val="0"/>
         <w:spacing w:after="160" w:line="240" w:lineRule="auto"/>
       </w:pPr>
       <w:r>
@@ -396,6 +461,7 @@
     </w:p>
     <w:p>
       <w:pPr>
+        <w:keepLines w:val="0"/>
         <w:spacing w:after="160" w:line="240" w:lineRule="auto"/>
       </w:pPr>
       <w:r>
@@ -425,6 +491,7 @@
     </w:p>
     <w:p>
       <w:pPr>
+        <w:keepLines w:val="0"/>
         <w:spacing w:after="160" w:line="240" w:lineRule="auto"/>
       </w:pPr>
       <w:r>
@@ -433,7 +500,7 @@
           <w:color w:val="101317"/>
           <w:sz w:val="22"/>
         </w:rPr>
-        <w:t>I shipped NanoISA v2 and NanoVM v2: a regular portable instruction set, a v2 module format, stack and type verification, return-shape and ownership checks, fuzzed parsing surfaces, cycle collection, and measured dispatch. See docs/RELEASE_4.0.md.</w:t>
+        <w:t>My historical 4.0 release shipped NanoISA v2 and NanoVM v2: a regular portable instruction set, a v2 module format, modeled stack and type checks, return-shape and abstract retain/release checks, parser tests, cycle collection, and measured dispatch. See docs/RELEASE_4.0.md. This is not a whole-program safety proof.</w:t>
       </w:r>
     </w:p>
     <w:p>
@@ -446,6 +513,7 @@
     </w:p>
     <w:p>
       <w:pPr>
+        <w:keepLines w:val="0"/>
         <w:spacing w:after="160" w:line="240" w:lineRule="auto"/>
       </w:pPr>
       <w:r>
@@ -467,6 +535,7 @@
     </w:p>
     <w:p>
       <w:pPr>
+        <w:keepLines w:val="0"/>
         <w:spacing w:after="160" w:line="240" w:lineRule="auto"/>
       </w:pPr>
       <w:r>
@@ -496,6 +565,7 @@
     </w:p>
     <w:p>
       <w:pPr>
+        <w:keepLines w:val="0"/>
         <w:spacing w:after="160" w:line="240" w:lineRule="auto"/>
       </w:pPr>
       <w:r>
@@ -517,6 +587,7 @@
     </w:p>
     <w:p>
       <w:pPr>
+        <w:keepLines w:val="0"/>
         <w:spacing w:after="160" w:line="240" w:lineRule="auto"/>
       </w:pPr>
       <w:r>
@@ -538,6 +609,7 @@
     </w:p>
     <w:p>
       <w:pPr>
+        <w:keepLines w:val="0"/>
         <w:spacing w:after="160" w:line="240" w:lineRule="auto"/>
       </w:pPr>
       <w:r>
@@ -546,7 +618,7 @@
           <w:color w:val="101317"/>
           <w:sz w:val="22"/>
         </w:rPr>
-        <w:t>NSI v0 is a fail-closed document of ids, payloads, and compatibility. Generators emit NanoLang, Forth, Python, Rust, and C++ stubs. Unforgeable NlCap tokens, capability-scoped shared memory, and a POSIX supervisor host services on an ordinary kernel. I do not claim a kernel, or a CUDA or CPython wrap. Authority: docs/NSI.md, docs/NSI_FABRIC.md, docs/NSI_TCB.md.</w:t>
+        <w:t>NSI v0 specifies ids, payloads, and compatibility with fail-closed checks. Generators emit NanoLang, Forth, Python, Rust, and C++ stubs. Checked capability APIs, shared memory, and a POSIX supervisor provide runtime foundations on an ordinary kernel. Laboratory tests do not establish unforgeability against a hostile process or production isolation. I do not claim a kernel, or a CUDA or CPython wrap. Authority: docs/NSI.md, docs/NSI_FABRIC.md, docs/NSI_TCB.md.</w:t>
       </w:r>
     </w:p>
     <w:p>
@@ -559,6 +631,7 @@
     </w:p>
     <w:p>
       <w:pPr>
+        <w:keepLines w:val="0"/>
         <w:spacing w:after="160" w:line="240" w:lineRule="auto"/>
       </w:pPr>
       <w:r>
@@ -580,6 +653,7 @@
     </w:p>
     <w:p>
       <w:pPr>
+        <w:keepLines w:val="0"/>
         <w:spacing w:after="160" w:line="240" w:lineRule="auto"/>
       </w:pPr>
       <w:r>
@@ -588,7 +662,7 @@
           <w:color w:val="101317"/>
           <w:sz w:val="22"/>
         </w:rPr>
-        <w:t>schema/nsi/effect_map.v0.json maps source effects, NanoISA traps, NSI methods, and capabilities. I emit an inventory, generate a deployment manifest, and reject uncovered grants. A versioned journal records trap-boundary events and replays the recorded result without calling the original service. HMAC-SHA256 authenticates a journal with a deployment key; that is not PKI. Checkpoints are sequence numbers, not heap snapshots. The journal is a tested C library in this tag and is not hooked into every vm.c trap. Authority: docs/NSI_EFFECTS.md.</w:t>
+        <w:t>schema/nsi/effect_map.v0.json maps source effects, NanoISA traps, NSI methods, and capabilities. I emit an inventory, generate a deployment manifest, and reject uncovered grants. A versioned journal records trap-boundary events and replays the recorded result without calling the original service. HMAC-SHA256 authenticates a journal with a deployment key; that is not PKI. Checkpoints are sequence numbers, not heap snapshots. The journal is a tested C library, not a hook on every vm.c trap. Authority: docs/NSI_EFFECTS.md.</w:t>
       </w:r>
     </w:p>
     <w:p>
@@ -601,6 +675,7 @@
     </w:p>
     <w:p>
       <w:pPr>
+        <w:keepLines w:val="0"/>
         <w:spacing w:after="160" w:line="240" w:lineRule="auto"/>
       </w:pPr>
       <w:r>
@@ -609,7 +684,26 @@
           <w:color w:val="101317"/>
           <w:sz w:val="22"/>
         </w:rPr>
-        <w:t>I have not claimed a Forth Standard System, reviewed human translations, GNU Emacs compatibility, a kernel, CUDA or CPython as wrapped runtimes, Makefile header dependencies (GitHub issue #211), or the 5.0 one-IR rewrite. See docs/RELEASE_4.5.md and docs/ROADMAP.md.</w:t>
+        <w:t>I have not completed a Forth Standard System, reviewed human translations, GNU Emacs compatibility, a kernel, CUDA or CPython as wrapped runtimes, full backend parity, complete ownership analysis, production service isolation, or the 5.0 one-IR work. See docs/ROADMAP.md; historical release scope is in docs/RELEASE_4.5.md.</w:t>
+      </w:r>
+    </w:p>
+    <w:p>
+      <w:pPr>
+        <w:keepLines w:val="0"/>
+        <w:spacing w:after="160" w:line="240" w:lineRule="auto"/>
+      </w:pPr>
+      <w:r>
+        <w:rPr>
+          <w:rFonts w:ascii="Calibri" w:hAnsi="Calibri"/>
+          <w:color w:val="101317"/>
+          <w:sz w:val="22"/>
+        </w:rPr>
+        <w:t>I have implemented transitive C header dependencies in Makefile.gnu, resolving the implementation gap recorded as GitHub issue #211. The focused gate is make test-make-header-dependencies. Broader native-cache snapshot and publication requirements remain separate work.</w:t>
+      </w:r>
+    </w:p>
+    <w:p>
+      <w:r>
+        <w:br w:type="page"/>
       </w:r>
     </w:p>
     <w:p>
@@ -630,6 +724,7 @@
     </w:p>
     <w:p>
       <w:pPr>
+        <w:keepLines w:val="0"/>
         <w:spacing w:after="160" w:line="240" w:lineRule="auto"/>
       </w:pPr>
       <w:r>
@@ -651,6 +746,7 @@
     </w:p>
     <w:p>
       <w:pPr>
+        <w:keepLines/>
         <w:spacing w:after="160" w:line="240" w:lineRule="auto"/>
       </w:pPr>
       <w:r>
@@ -670,6 +766,7 @@
     </w:p>
     <w:p>
       <w:pPr>
+        <w:keepLines w:val="0"/>
         <w:spacing w:after="160" w:line="240" w:lineRule="auto"/>
       </w:pPr>
       <w:r>

</xml_diff>

<commit_message>
MAC task task_8500a5ea65584cc3a5cfb02a7812b16b: Preserve paired compiler arguments across metadata fragments
</commit_message>
<xml_diff>
--- a/docs/presentation/nanolang-developer-overview.docx
+++ b/docs/presentation/nanolang-developer-overview.docx
@@ -20,6 +20,7 @@
     </w:p>
     <w:p>
       <w:pPr>
+        <w:keepLines w:val="0"/>
         <w:spacing w:after="160" w:line="240" w:lineRule="auto"/>
       </w:pPr>
       <w:r>
@@ -28,11 +29,12 @@
           <w:color w:val="101317"/>
           <w:sz w:val="22"/>
         </w:rPr>
-        <w:t>I am NanoLang. This is my developer narrative for release 4.5. It explains my language contract, compiler paths, NanoISA bytecode, NanoVM execution, foreign-function boundary, Nano Service Interface, POSIX capability fabric, trap journal, tests, diagnostics, and the work I have not done. I am a language and a secure runtime. I do not claim a kernel.</w:t>
+        <w:t>I am NanoLang. This is my unpublished 5.0 development draft, not a release-readiness claim. It explains my language contract, compiler paths, NanoISA bytecode, NanoVM execution, foreign-function boundary, Nano Service Interface, POSIX capability fabric, trap journal, tests, diagnostics, and unfinished work. My runtime foundations are under development. Laboratory service tests do not establish production isolation. I do not claim a kernel.</w:t>
       </w:r>
     </w:p>
     <w:p>
       <w:pPr>
+        <w:keepLines w:val="0"/>
         <w:spacing w:after="160" w:line="240" w:lineRule="auto"/>
       </w:pPr>
       <w:r>
@@ -54,6 +56,7 @@
     </w:p>
     <w:p>
       <w:pPr>
+        <w:keepLines w:val="0"/>
         <w:spacing w:after="160" w:line="240" w:lineRule="auto"/>
       </w:pPr>
       <w:r>
@@ -83,6 +86,7 @@
     </w:p>
     <w:p>
       <w:pPr>
+        <w:keepLines w:val="0"/>
         <w:spacing w:after="160" w:line="240" w:lineRule="auto"/>
       </w:pPr>
       <w:r>
@@ -96,6 +100,7 @@
     </w:p>
     <w:p>
       <w:pPr>
+        <w:keepLines/>
         <w:spacing w:after="160" w:line="240" w:lineRule="auto"/>
       </w:pPr>
       <w:r>
@@ -106,7 +111,9 @@
         </w:rPr>
         <w:t>fn gcd(a: int, b: int) -&gt; int {</w:t>
         <w:br/>
-        <w:t xml:space="preserve">    return a</w:t>
+        <w:t xml:space="preserve">    if (== b 0) { return a }</w:t>
+        <w:br/>
+        <w:t xml:space="preserve">    return (gcd b (% a b))</w:t>
         <w:br/>
         <w:t>}</w:t>
         <w:br/>
@@ -115,7 +122,25 @@
         <w:br/>
         <w:t xml:space="preserve">    assert (== (gcd 48 18) 6)</w:t>
         <w:br/>
+        <w:t xml:space="preserve">    assert (== (gcd 18 0) 18)</w:t>
+        <w:br/>
+        <w:t xml:space="preserve">    assert (== (gcd 0 0) 0)</w:t>
+        <w:br/>
         <w:t>}</w:t>
+      </w:r>
+    </w:p>
+    <w:p>
+      <w:pPr>
+        <w:keepLines w:val="0"/>
+        <w:spacing w:after="160" w:line="240" w:lineRule="auto"/>
+      </w:pPr>
+      <w:r>
+        <w:rPr>
+          <w:rFonts w:ascii="Calibri" w:hAnsi="Calibri"/>
+          <w:color w:val="101317"/>
+          <w:sz w:val="22"/>
+        </w:rPr>
+        <w:t>This example checks selected nonnegative and zero inputs. It is not a theorem for every integer.</w:t>
       </w:r>
     </w:p>
     <w:p>
@@ -128,6 +153,7 @@
     </w:p>
     <w:p>
       <w:pPr>
+        <w:keepLines w:val="0"/>
         <w:spacing w:after="160" w:line="240" w:lineRule="auto"/>
       </w:pPr>
       <w:r>
@@ -136,7 +162,21 @@
           <w:color w:val="101317"/>
           <w:sz w:val="22"/>
         </w:rPr>
-        <w:t>Every eligible function carries a shadow test. The test is an executable statement about behavior. It is not a coverage decoration and it is not a substitute for integration tests.</w:t>
+        <w:t>My project policy requires useful shadows. My compiler currently warns about missing tests, with exemptions documented in docs/CANONICAL_STYLE.md. A shadow checks its assertions; it does not prove every input or replace integration tests.</w:t>
+      </w:r>
+    </w:p>
+    <w:p>
+      <w:pPr>
+        <w:keepLines w:val="0"/>
+        <w:spacing w:after="160" w:line="240" w:lineRule="auto"/>
+      </w:pPr>
+      <w:r>
+        <w:rPr>
+          <w:rFonts w:ascii="Calibri" w:hAnsi="Calibri"/>
+          <w:color w:val="101317"/>
+          <w:sz w:val="22"/>
+        </w:rPr>
+        <w:t>My C seed, self-hosted native driver, and bytecode CLI select root and transitive dependency shadows by default, with an explicit root-only opt-out. They run tests in separate processes under parent deadlines before publishing output. This is not a security sandbox. Source-only C emission does not execute tests.</w:t>
       </w:r>
     </w:p>
     <w:p>
@@ -149,6 +189,7 @@
     </w:p>
     <w:p>
       <w:pPr>
+        <w:keepLines w:val="0"/>
         <w:spacing w:after="160" w:line="240" w:lineRule="auto"/>
       </w:pPr>
       <w:r>
@@ -157,7 +198,7 @@
           <w:color w:val="101317"/>
           <w:sz w:val="22"/>
         </w:rPr>
-        <w:t>My NanoCore semantics have mechanized proofs for preservation, progress, determinism, semantic equivalence, and evaluator soundness. Full NanoLang, NanoISA, FFI, NSI, and generated-C behavior remains outside that proved subset unless explicitly stated otherwise.</w:t>
+        <w:t>My NanoCore model states mechanized proofs for preservation, progress, determinism, semantic equivalence, and evaluator soundness under the hypotheses in formal/README.md and the theorem statements. These do not establish correspondence with my production parser, typechecker, compilers, NanoVM, FFI, NSI, or host. That correspondence requires separate evidence.</w:t>
       </w:r>
     </w:p>
     <w:p>
@@ -178,6 +219,7 @@
     </w:p>
     <w:p>
       <w:pPr>
+        <w:keepLines w:val="0"/>
         <w:spacing w:after="160" w:line="240" w:lineRule="auto"/>
       </w:pPr>
       <w:r>
@@ -186,7 +228,7 @@
           <w:color w:val="101317"/>
           <w:sz w:val="22"/>
         </w:rPr>
-        <w:t>nanoc lowers NanoLang to generated C and links the runtime libraries. This is my native production path. The generated program carries the behavior of the source only after compilation and its tests pass.</w:t>
+        <w:t>nanoc lowers NanoLang to generated C and links the runtime libraries. This is my native execution path. Passing compilation and tests supplies evidence for the cases checked, not semantic equivalence. Full backend parity remains roadmap work.</w:t>
       </w:r>
     </w:p>
     <w:p>
@@ -199,6 +241,7 @@
     </w:p>
     <w:p>
       <w:pPr>
+        <w:keepLines w:val="0"/>
         <w:spacing w:after="160" w:line="240" w:lineRule="auto"/>
       </w:pPr>
       <w:r>
@@ -212,6 +255,7 @@
     </w:p>
     <w:p>
       <w:pPr>
+        <w:keepLines/>
         <w:spacing w:after="160" w:line="240" w:lineRule="auto"/>
       </w:pPr>
       <w:r>
@@ -233,6 +277,7 @@
     </w:p>
     <w:p>
       <w:pPr>
+        <w:keepLines w:val="0"/>
         <w:spacing w:after="160" w:line="240" w:lineRule="auto"/>
       </w:pPr>
       <w:r>
@@ -254,6 +299,7 @@
     </w:p>
     <w:p>
       <w:pPr>
+        <w:keepLines w:val="0"/>
         <w:spacing w:after="160" w:line="240" w:lineRule="auto"/>
       </w:pPr>
       <w:r>
@@ -283,6 +329,7 @@
     </w:p>
     <w:p>
       <w:pPr>
+        <w:keepLines w:val="0"/>
         <w:spacing w:after="160" w:line="240" w:lineRule="auto"/>
       </w:pPr>
       <w:r>
@@ -296,6 +343,20 @@
     </w:p>
     <w:p>
       <w:pPr>
+        <w:keepLines w:val="0"/>
+        <w:spacing w:after="160" w:line="240" w:lineRule="auto"/>
+      </w:pPr>
+      <w:r>
+        <w:rPr>
+          <w:rFonts w:ascii="Calibri" w:hAnsi="Calibri"/>
+          <w:color w:val="101317"/>
+          <w:sz w:val="22"/>
+        </w:rPr>
+        <w:t>My verifier tracks an abstract balance of explicit retain/release instructions, not object identity or complete source ownership. Tested cycle collection is not complete leak freedom. Unknown operand types are not proved safe.</w:t>
+      </w:r>
+    </w:p>
+    <w:p>
+      <w:pPr>
         <w:pStyle w:val="Heading2"/>
       </w:pPr>
       <w:r>
@@ -304,6 +365,7 @@
     </w:p>
     <w:p>
       <w:pPr>
+        <w:keepLines w:val="0"/>
         <w:spacing w:after="160" w:line="240" w:lineRule="auto"/>
       </w:pPr>
       <w:r>
@@ -325,6 +387,7 @@
     </w:p>
     <w:p>
       <w:pPr>
+        <w:keepLines w:val="0"/>
         <w:spacing w:after="160" w:line="240" w:lineRule="auto"/>
       </w:pPr>
       <w:r>
@@ -349,11 +412,12 @@
         <w:pStyle w:val="Heading2"/>
       </w:pPr>
       <w:r>
-        <w:t>Tests</w:t>
+        <w:t>Unit, integration, and shadow tests</w:t>
       </w:r>
     </w:p>
     <w:p>
       <w:pPr>
+        <w:keepLines w:val="0"/>
         <w:spacing w:after="160" w:line="240" w:lineRule="auto"/>
       </w:pPr>
       <w:r>
@@ -362,7 +426,7 @@
           <w:color w:val="101317"/>
           <w:sz w:val="22"/>
         </w:rPr>
-        <w:t>4.0 counted 2,632 NanoISA tests, 621 NanoVM tests, 63 NanoVirt tests, and 93 verifier tests at the v4.0.0 tag. 4.1–4.5 add NSI, fabric, catalog, Forth, nano_emacs_worker, policy, journal, and observability suites on top of that. CI exercises x64, arm64, sanitizers, coverage, documentation, benchmarks, and security checks.</w:t>
+        <w:t>4.0 counted 2,632 NanoISA tests, 621 NanoVM tests, 63 NanoVirt tests, and 93 verifier tests at the v4.0.0 tag. 4.1–4.5 added NSI, fabric, catalog, Forth, nano_emacs_worker, policy, journal, and observability suites. These are historical counts, not fresh results for this draft. Configured CI workflows and local passing gates are distinct evidence; neither implies that every hosted check ran for this revision.</w:t>
       </w:r>
     </w:p>
     <w:p>
@@ -375,6 +439,7 @@
     </w:p>
     <w:p>
       <w:pPr>
+        <w:keepLines w:val="0"/>
         <w:spacing w:after="160" w:line="240" w:lineRule="auto"/>
       </w:pPr>
       <w:r>
@@ -396,6 +461,7 @@
     </w:p>
     <w:p>
       <w:pPr>
+        <w:keepLines w:val="0"/>
         <w:spacing w:after="160" w:line="240" w:lineRule="auto"/>
       </w:pPr>
       <w:r>
@@ -425,6 +491,7 @@
     </w:p>
     <w:p>
       <w:pPr>
+        <w:keepLines w:val="0"/>
         <w:spacing w:after="160" w:line="240" w:lineRule="auto"/>
       </w:pPr>
       <w:r>
@@ -433,7 +500,7 @@
           <w:color w:val="101317"/>
           <w:sz w:val="22"/>
         </w:rPr>
-        <w:t>I shipped NanoISA v2 and NanoVM v2: a regular portable instruction set, a v2 module format, stack and type verification, return-shape and ownership checks, fuzzed parsing surfaces, cycle collection, and measured dispatch. See docs/RELEASE_4.0.md.</w:t>
+        <w:t>My historical 4.0 release shipped NanoISA v2 and NanoVM v2: a regular portable instruction set, a v2 module format, modeled stack and type checks, return-shape and abstract retain/release checks, parser tests, cycle collection, and measured dispatch. See docs/RELEASE_4.0.md. This is not a whole-program safety proof.</w:t>
       </w:r>
     </w:p>
     <w:p>
@@ -446,6 +513,7 @@
     </w:p>
     <w:p>
       <w:pPr>
+        <w:keepLines w:val="0"/>
         <w:spacing w:after="160" w:line="240" w:lineRule="auto"/>
       </w:pPr>
       <w:r>
@@ -467,6 +535,7 @@
     </w:p>
     <w:p>
       <w:pPr>
+        <w:keepLines w:val="0"/>
         <w:spacing w:after="160" w:line="240" w:lineRule="auto"/>
       </w:pPr>
       <w:r>
@@ -496,6 +565,7 @@
     </w:p>
     <w:p>
       <w:pPr>
+        <w:keepLines w:val="0"/>
         <w:spacing w:after="160" w:line="240" w:lineRule="auto"/>
       </w:pPr>
       <w:r>
@@ -517,6 +587,7 @@
     </w:p>
     <w:p>
       <w:pPr>
+        <w:keepLines w:val="0"/>
         <w:spacing w:after="160" w:line="240" w:lineRule="auto"/>
       </w:pPr>
       <w:r>
@@ -538,6 +609,7 @@
     </w:p>
     <w:p>
       <w:pPr>
+        <w:keepLines w:val="0"/>
         <w:spacing w:after="160" w:line="240" w:lineRule="auto"/>
       </w:pPr>
       <w:r>
@@ -546,7 +618,7 @@
           <w:color w:val="101317"/>
           <w:sz w:val="22"/>
         </w:rPr>
-        <w:t>NSI v0 is a fail-closed document of ids, payloads, and compatibility. Generators emit NanoLang, Forth, Python, Rust, and C++ stubs. Unforgeable NlCap tokens, capability-scoped shared memory, and a POSIX supervisor host services on an ordinary kernel. I do not claim a kernel, or a CUDA or CPython wrap. Authority: docs/NSI.md, docs/NSI_FABRIC.md, docs/NSI_TCB.md.</w:t>
+        <w:t>NSI v0 specifies ids, payloads, and compatibility with fail-closed checks. Generators emit NanoLang, Forth, Python, Rust, and C++ stubs. Checked capability APIs, shared memory, and a POSIX supervisor provide runtime foundations on an ordinary kernel. Laboratory tests do not establish unforgeability against a hostile process or production isolation. I do not claim a kernel, or a CUDA or CPython wrap. Authority: docs/NSI.md, docs/NSI_FABRIC.md, docs/NSI_TCB.md.</w:t>
       </w:r>
     </w:p>
     <w:p>
@@ -559,6 +631,7 @@
     </w:p>
     <w:p>
       <w:pPr>
+        <w:keepLines w:val="0"/>
         <w:spacing w:after="160" w:line="240" w:lineRule="auto"/>
       </w:pPr>
       <w:r>
@@ -580,6 +653,7 @@
     </w:p>
     <w:p>
       <w:pPr>
+        <w:keepLines w:val="0"/>
         <w:spacing w:after="160" w:line="240" w:lineRule="auto"/>
       </w:pPr>
       <w:r>
@@ -588,7 +662,7 @@
           <w:color w:val="101317"/>
           <w:sz w:val="22"/>
         </w:rPr>
-        <w:t>schema/nsi/effect_map.v0.json maps source effects, NanoISA traps, NSI methods, and capabilities. I emit an inventory, generate a deployment manifest, and reject uncovered grants. A versioned journal records trap-boundary events and replays the recorded result without calling the original service. HMAC-SHA256 authenticates a journal with a deployment key; that is not PKI. Checkpoints are sequence numbers, not heap snapshots. The journal is a tested C library in this tag and is not hooked into every vm.c trap. Authority: docs/NSI_EFFECTS.md.</w:t>
+        <w:t>schema/nsi/effect_map.v0.json maps source effects, NanoISA traps, NSI methods, and capabilities. I emit an inventory, generate a deployment manifest, and reject uncovered grants. A versioned journal records trap-boundary events and replays the recorded result without calling the original service. HMAC-SHA256 authenticates a journal with a deployment key; that is not PKI. Checkpoints are sequence numbers, not heap snapshots. The journal is a tested C library, not a hook on every vm.c trap. Authority: docs/NSI_EFFECTS.md.</w:t>
       </w:r>
     </w:p>
     <w:p>
@@ -601,6 +675,7 @@
     </w:p>
     <w:p>
       <w:pPr>
+        <w:keepLines w:val="0"/>
         <w:spacing w:after="160" w:line="240" w:lineRule="auto"/>
       </w:pPr>
       <w:r>
@@ -609,7 +684,26 @@
           <w:color w:val="101317"/>
           <w:sz w:val="22"/>
         </w:rPr>
-        <w:t>I have not claimed a Forth Standard System, reviewed human translations, GNU Emacs compatibility, a kernel, CUDA or CPython as wrapped runtimes, Makefile header dependencies (GitHub issue #211), or the 5.0 one-IR rewrite. See docs/RELEASE_4.5.md and docs/ROADMAP.md.</w:t>
+        <w:t>I have not completed a Forth Standard System, reviewed human translations, GNU Emacs compatibility, a kernel, CUDA or CPython as wrapped runtimes, full backend parity, complete ownership analysis, production service isolation, or the 5.0 one-IR work. See docs/ROADMAP.md; historical release scope is in docs/RELEASE_4.5.md.</w:t>
+      </w:r>
+    </w:p>
+    <w:p>
+      <w:pPr>
+        <w:keepLines w:val="0"/>
+        <w:spacing w:after="160" w:line="240" w:lineRule="auto"/>
+      </w:pPr>
+      <w:r>
+        <w:rPr>
+          <w:rFonts w:ascii="Calibri" w:hAnsi="Calibri"/>
+          <w:color w:val="101317"/>
+          <w:sz w:val="22"/>
+        </w:rPr>
+        <w:t>I have implemented transitive C header dependencies in Makefile.gnu, resolving the implementation gap recorded as GitHub issue #211. The focused gate is make test-make-header-dependencies. Broader native-cache snapshot and publication requirements remain separate work.</w:t>
+      </w:r>
+    </w:p>
+    <w:p>
+      <w:r>
+        <w:br w:type="page"/>
       </w:r>
     </w:p>
     <w:p>
@@ -630,6 +724,7 @@
     </w:p>
     <w:p>
       <w:pPr>
+        <w:keepLines w:val="0"/>
         <w:spacing w:after="160" w:line="240" w:lineRule="auto"/>
       </w:pPr>
       <w:r>
@@ -651,6 +746,7 @@
     </w:p>
     <w:p>
       <w:pPr>
+        <w:keepLines/>
         <w:spacing w:after="160" w:line="240" w:lineRule="auto"/>
       </w:pPr>
       <w:r>
@@ -670,6 +766,7 @@
     </w:p>
     <w:p>
       <w:pPr>
+        <w:keepLines w:val="0"/>
         <w:spacing w:after="160" w:line="240" w:lineRule="auto"/>
       </w:pPr>
       <w:r>

</xml_diff>

<commit_message>
Refresh 5.0 release scope, callback documentation and local presentation
</commit_message>
<xml_diff>
--- a/docs/presentation/nanolang-developer-overview.docx
+++ b/docs/presentation/nanolang-developer-overview.docx
@@ -43,7 +43,7 @@
           <w:color w:val="101317"/>
           <w:sz w:val="22"/>
         </w:rPr>
-        <w:t>Authority: docs/PERSONA.md, README.md, docs/NANOISA.md, docs/NSI.md, docs/NSI_FABRIC.md, docs/NSI_EFFECTS.md, docs/NANO_EMACS.md, docs/ROADMAP.md, spec/nanoisa.yaml, docs/RELEASE_4.5.md, and the current test suites.</w:t>
+        <w:t>Authority: docs/PERSONA.md, README.md, docs/NANOISA.md, docs/NSI.md, docs/NSI_FABRIC.md, docs/NSI_EFFECTS.md, docs/NANO_EMACS.md, docs/ROADMAP.md, spec/nanoisa.yaml, docs/RELEASE_5.0.md, docs/CALLBACK_ABI.md, and the current test suites.</w:t>
       </w:r>
     </w:p>
     <w:p>
@@ -670,6 +670,42 @@
         <w:pStyle w:val="Heading1"/>
       </w:pPr>
       <w:r>
+        <w:t>My 5.0 candidate contract</w:t>
+      </w:r>
+    </w:p>
+    <w:p>
+      <w:pPr>
+        <w:keepLines w:val="0"/>
+        <w:spacing w:after="160" w:line="240" w:lineRule="auto"/>
+      </w:pPr>
+      <w:r>
+        <w:rPr>
+          <w:rFonts w:ascii="Calibri" w:hAnsi="Calibri"/>
+          <w:color w:val="101317"/>
+          <w:sz w:val="22"/>
+        </w:rPr>
+        <w:t>I make return leave the enclosing function, run dependency shadows by default, preserve module identity and harden private native artifacts. My retained callback bridge carries signatures and lifetimes, executes on the VM owner thread and handles cancellation. Dispatch and SDL_mixer adapters use that in-process bridge; callback-bearing isolated imports remain unsupported. C-seed imported callback shadows select the same bridge. See docs/RELEASE_5.0.md and docs/CALLBACK_ABI.md.</w:t>
+      </w:r>
+    </w:p>
+    <w:p>
+      <w:pPr>
+        <w:keepLines w:val="0"/>
+        <w:spacing w:after="160" w:line="240" w:lineRule="auto"/>
+      </w:pPr>
+      <w:r>
+        <w:rPr>
+          <w:rFonts w:ascii="Calibri" w:hAnsi="Calibri"/>
+          <w:color w:val="101317"/>
+          <w:sz w:val="22"/>
+        </w:rPr>
+        <w:t>The 2026-09-16 Linux finalization checkpoint records 1,730 native translator checks, 1,073 shape checks, 272,379 VM checks and 242 example programs. These are dated integration results, not acceptance of every subsequent commit. Native and VM effect repairs remain in progress. Final clean-tree tests and platform CI must establish the exact revision to release.</w:t>
+      </w:r>
+    </w:p>
+    <w:p>
+      <w:pPr>
+        <w:pStyle w:val="Heading1"/>
+      </w:pPr>
+      <w:r>
         <w:t>What I have not done</w:t>
       </w:r>
     </w:p>
@@ -684,7 +720,7 @@
           <w:color w:val="101317"/>
           <w:sz w:val="22"/>
         </w:rPr>
-        <w:t>I have not completed a Forth Standard System, reviewed human translations, GNU Emacs compatibility, a kernel, CUDA or CPython as wrapped runtimes, full backend parity, complete ownership analysis, production service isolation, or the 5.0 one-IR work. See docs/ROADMAP.md; historical release scope is in docs/RELEASE_4.5.md.</w:t>
+        <w:t>I have not completed a Forth Standard System, reviewed human translations, GNU Emacs compatibility, a kernel, CUDA or CPython as wrapped runtimes, full backend parity, complete ownership analysis, production service isolation, or NanoISA-only self-hosted compilation with matching Stage 1/Stage 2 .nvm artifacts. See docs/ROADMAP.md; historical release scope is in docs/RELEASE_4.5.md.</w:t>
       </w:r>
     </w:p>
     <w:p>
@@ -733,7 +769,7 @@
           <w:color w:val="101317"/>
           <w:sz w:val="22"/>
         </w:rPr>
-        <w:t>Start with docs/PERSONA.md, docs/ROADMAP.md, docs/RELEASE_4.5.md, userguide/guide/08_secure_runtime.md, the relevant source symbols, and the matching tests. Do not turn a roadmap sentence into a feature claim.</w:t>
+        <w:t>Start with docs/PERSONA.md, docs/ROADMAP.md, docs/RELEASE_5.0.md, userguide/guide/08_secure_runtime.md, the relevant source symbols, and the matching tests. Do not turn a roadmap sentence into a feature claim.</w:t>
       </w:r>
     </w:p>
     <w:p>

</xml_diff>

<commit_message>
Refresh 5.0 release edition with bounded integration evidence
</commit_message>
<xml_diff>
--- a/docs/presentation/nanolang-developer-overview.docx
+++ b/docs/presentation/nanolang-developer-overview.docx
@@ -29,7 +29,7 @@
           <w:color w:val="101317"/>
           <w:sz w:val="22"/>
         </w:rPr>
-        <w:t>I am NanoLang. This is my unpublished 5.0 development draft, not a release-readiness claim. It explains my language contract, compiler paths, NanoISA bytecode, NanoVM execution, foreign-function boundary, Nano Service Interface, POSIX capability fabric, trap journal, tests, diagnostics, and unfinished work. My runtime foundations are under development. Laboratory service tests do not establish production isolation. I do not claim a kernel.</w:t>
+        <w:t>I am NanoLang. This is my local 5.0 release edition. My tag requires the exact-commit release gates. It explains my language contract, compiler paths, NanoISA bytecode, NanoVM execution, foreign-function boundary, Nano Service Interface, POSIX capability fabric, trap journal, tests, diagnostics, and unfinished work. My runtime foundations are under development. Laboratory service tests do not establish production isolation. I do not claim a kernel.</w:t>
       </w:r>
     </w:p>
     <w:p>
@@ -426,7 +426,7 @@
           <w:color w:val="101317"/>
           <w:sz w:val="22"/>
         </w:rPr>
-        <w:t>4.0 counted 2,632 NanoISA tests, 621 NanoVM tests, 63 NanoVirt tests, and 93 verifier tests at the v4.0.0 tag. 4.1–4.5 added NSI, fabric, catalog, Forth, nano_emacs_worker, policy, journal, and observability suites. These are historical counts, not fresh results for this draft. Configured CI workflows and local passing gates are distinct evidence; neither implies that every hosted check ran for this revision.</w:t>
+        <w:t>4.0 counted 2,632 NanoISA tests, 621 NanoVM tests, 63 NanoVirt tests, and 93 verifier tests at the v4.0.0 tag. 4.1–4.5 added NSI, fabric, catalog, Forth, nano_emacs_worker, policy, journal, and observability suites. These are historical counts, not fresh results for this edition. Configured CI workflows and local passing gates are distinct evidence; neither implies that every hosted check ran for this revision.</w:t>
       </w:r>
     </w:p>
     <w:p>
@@ -666,11 +666,16 @@
       </w:r>
     </w:p>
     <w:p>
+      <w:r>
+        <w:br w:type="page"/>
+      </w:r>
+    </w:p>
+    <w:p>
       <w:pPr>
         <w:pStyle w:val="Heading1"/>
       </w:pPr>
       <w:r>
-        <w:t>My 5.0 candidate contract</w:t>
+        <w:t>My 5.0 release contract</w:t>
       </w:r>
     </w:p>
     <w:p>
@@ -698,7 +703,7 @@
           <w:color w:val="101317"/>
           <w:sz w:val="22"/>
         </w:rPr>
-        <w:t>The 2026-09-16 Linux finalization checkpoint records 1,739 native translator checks, 1,073 shape checks, 272,379 VM checks and 242 example programs. These are dated integration results, not acceptance of every subsequent commit. Native and VM effect repairs remain in progress. Final clean-tree tests and platform CI must establish the exact revision to release.</w:t>
+        <w:t>My 2026-09-16 checkpoints record 1,739 native translator checks, 1,073 shape checks, 272,403 VM checks, 89 VM codegen checks and 175 verified/equivalent programs. A clean bootstrap passed at 4373abc5. Darwin passed 14 effect tests, 49 scoping checks and 39 executable guide snippets. An ownership sanitizer run exercised 52,000 activations. Strict Linux ARM64 acceptance passed all 185 selected native example artifacts with unchanged selection/exclusions, plus five root/examples-working-directory regression compilations. These are bounded integration results, not acceptance of every later revision. Exact-commit clean-tree tests, platform CI and release acceptance are mandatory release gates.</w:t>
       </w:r>
     </w:p>
     <w:p>

</xml_diff>

<commit_message>
Audit native call argument evaluation order across backends (task_8bee9e1410ad44c2ab714b8dab98fdfa) (#359)
Landed by the MAC control plane after review approval.

- task: `task_8bee9e1410ad44c2ab714b8dab98fdfa`
- reviewed head: `94f872895a38369340dd7fa6ab688f9843ca7719`
- base at publication: `a06cbc118d260832342544e7badd7c7046ae0af6`
</commit_message>
<xml_diff>
--- a/docs/presentation/nanolang-developer-overview.docx
+++ b/docs/presentation/nanolang-developer-overview.docx
@@ -20,7 +20,6 @@
     </w:p>
     <w:p>
       <w:pPr>
-        <w:keepLines w:val="0"/>
         <w:spacing w:after="160" w:line="240" w:lineRule="auto"/>
       </w:pPr>
       <w:r>
@@ -29,12 +28,11 @@
           <w:color w:val="101317"/>
           <w:sz w:val="22"/>
         </w:rPr>
-        <w:t>I am NanoLang. This is my local 5.0 release edition. My tag requires the exact-commit release gates. It explains my language contract, compiler paths, NanoISA bytecode, NanoVM execution, foreign-function boundary, Nano Service Interface, POSIX capability fabric, trap journal, tests, diagnostics, and unfinished work. My runtime foundations are under development. Laboratory service tests do not establish production isolation. I do not claim a kernel.</w:t>
+        <w:t>I am NanoLang. This is my developer narrative for release 4.5. It explains my language contract, compiler paths, NanoISA bytecode, NanoVM execution, foreign-function boundary, Nano Service Interface, POSIX capability fabric, trap journal, tests, diagnostics, and the work I have not done. I am a language and a secure runtime. I do not claim a kernel.</w:t>
       </w:r>
     </w:p>
     <w:p>
       <w:pPr>
-        <w:keepLines w:val="0"/>
         <w:spacing w:after="160" w:line="240" w:lineRule="auto"/>
       </w:pPr>
       <w:r>
@@ -43,7 +41,7 @@
           <w:color w:val="101317"/>
           <w:sz w:val="22"/>
         </w:rPr>
-        <w:t>Authority: docs/PERSONA.md, README.md, docs/NANOISA.md, docs/NSI.md, docs/NSI_FABRIC.md, docs/NSI_EFFECTS.md, docs/NANO_EMACS.md, docs/ROADMAP.md, spec/nanoisa.yaml, docs/RELEASE_5.0.md, docs/CALLBACK_ABI.md, and the current test suites.</w:t>
+        <w:t>Authority: docs/PERSONA.md, README.md, docs/NANOISA.md, docs/NSI.md, docs/NSI_FABRIC.md, docs/NSI_EFFECTS.md, docs/NANO_EMACS.md, docs/ROADMAP.md, spec/nanoisa.yaml, docs/RELEASE_4.5.md, and the current test suites.</w:t>
       </w:r>
     </w:p>
     <w:p>
@@ -56,7 +54,6 @@
     </w:p>
     <w:p>
       <w:pPr>
-        <w:keepLines w:val="0"/>
         <w:spacing w:after="160" w:line="240" w:lineRule="auto"/>
       </w:pPr>
       <w:r>
@@ -86,7 +83,6 @@
     </w:p>
     <w:p>
       <w:pPr>
-        <w:keepLines w:val="0"/>
         <w:spacing w:after="160" w:line="240" w:lineRule="auto"/>
       </w:pPr>
       <w:r>
@@ -100,7 +96,6 @@
     </w:p>
     <w:p>
       <w:pPr>
-        <w:keepLines/>
         <w:spacing w:after="160" w:line="240" w:lineRule="auto"/>
       </w:pPr>
       <w:r>
@@ -111,9 +106,7 @@
         </w:rPr>
         <w:t>fn gcd(a: int, b: int) -&gt; int {</w:t>
         <w:br/>
-        <w:t xml:space="preserve">    if (== b 0) { return a }</w:t>
-        <w:br/>
-        <w:t xml:space="preserve">    return (gcd b (% a b))</w:t>
+        <w:t xml:space="preserve">    return a</w:t>
         <w:br/>
         <w:t>}</w:t>
         <w:br/>
@@ -122,25 +115,7 @@
         <w:br/>
         <w:t xml:space="preserve">    assert (== (gcd 48 18) 6)</w:t>
         <w:br/>
-        <w:t xml:space="preserve">    assert (== (gcd 18 0) 18)</w:t>
-        <w:br/>
-        <w:t xml:space="preserve">    assert (== (gcd 0 0) 0)</w:t>
-        <w:br/>
         <w:t>}</w:t>
-      </w:r>
-    </w:p>
-    <w:p>
-      <w:pPr>
-        <w:keepLines w:val="0"/>
-        <w:spacing w:after="160" w:line="240" w:lineRule="auto"/>
-      </w:pPr>
-      <w:r>
-        <w:rPr>
-          <w:rFonts w:ascii="Calibri" w:hAnsi="Calibri"/>
-          <w:color w:val="101317"/>
-          <w:sz w:val="22"/>
-        </w:rPr>
-        <w:t>This example checks selected nonnegative and zero inputs. It is not a theorem for every integer.</w:t>
       </w:r>
     </w:p>
     <w:p>
@@ -153,7 +128,6 @@
     </w:p>
     <w:p>
       <w:pPr>
-        <w:keepLines w:val="0"/>
         <w:spacing w:after="160" w:line="240" w:lineRule="auto"/>
       </w:pPr>
       <w:r>
@@ -162,21 +136,7 @@
           <w:color w:val="101317"/>
           <w:sz w:val="22"/>
         </w:rPr>
-        <w:t>My project policy requires useful shadows. My compiler currently warns about missing tests, with exemptions documented in docs/CANONICAL_STYLE.md. A shadow checks its assertions; it does not prove every input or replace integration tests.</w:t>
-      </w:r>
-    </w:p>
-    <w:p>
-      <w:pPr>
-        <w:keepLines w:val="0"/>
-        <w:spacing w:after="160" w:line="240" w:lineRule="auto"/>
-      </w:pPr>
-      <w:r>
-        <w:rPr>
-          <w:rFonts w:ascii="Calibri" w:hAnsi="Calibri"/>
-          <w:color w:val="101317"/>
-          <w:sz w:val="22"/>
-        </w:rPr>
-        <w:t>My C seed, self-hosted native driver, and bytecode CLI select root and transitive dependency shadows by default, with an explicit root-only opt-out. They run tests in separate processes under parent deadlines before publishing output. This is not a security sandbox. Source-only C emission does not execute tests.</w:t>
+        <w:t>Every eligible function carries a shadow test. The test is an executable statement about behavior. It is not a coverage decoration and it is not a substitute for integration tests.</w:t>
       </w:r>
     </w:p>
     <w:p>
@@ -189,7 +149,6 @@
     </w:p>
     <w:p>
       <w:pPr>
-        <w:keepLines w:val="0"/>
         <w:spacing w:after="160" w:line="240" w:lineRule="auto"/>
       </w:pPr>
       <w:r>
@@ -198,7 +157,7 @@
           <w:color w:val="101317"/>
           <w:sz w:val="22"/>
         </w:rPr>
-        <w:t>My NanoCore model states mechanized proofs for preservation, progress, determinism, semantic equivalence, and evaluator soundness under the hypotheses in formal/README.md and the theorem statements. These do not establish correspondence with my production parser, typechecker, compilers, NanoVM, FFI, NSI, or host. That correspondence requires separate evidence.</w:t>
+        <w:t>My NanoCore semantics have mechanized proofs for preservation, progress, determinism, semantic equivalence, and evaluator soundness. Full NanoLang, NanoISA, FFI, NSI, and generated-C behavior remains outside that proved subset unless explicitly stated otherwise.</w:t>
       </w:r>
     </w:p>
     <w:p>
@@ -219,7 +178,6 @@
     </w:p>
     <w:p>
       <w:pPr>
-        <w:keepLines w:val="0"/>
         <w:spacing w:after="160" w:line="240" w:lineRule="auto"/>
       </w:pPr>
       <w:r>
@@ -228,7 +186,7 @@
           <w:color w:val="101317"/>
           <w:sz w:val="22"/>
         </w:rPr>
-        <w:t>nanoc lowers NanoLang to generated C and links the runtime libraries. This is my native execution path. Passing compilation and tests supplies evidence for the cases checked, not semantic equivalence. Full backend parity remains roadmap work.</w:t>
+        <w:t>nanoc lowers NanoLang to generated C and links the runtime libraries. This is my native production path. The generated program carries the behavior of the source only after compilation and its tests pass.</w:t>
       </w:r>
     </w:p>
     <w:p>
@@ -241,7 +199,6 @@
     </w:p>
     <w:p>
       <w:pPr>
-        <w:keepLines w:val="0"/>
         <w:spacing w:after="160" w:line="240" w:lineRule="auto"/>
       </w:pPr>
       <w:r>
@@ -255,7 +212,6 @@
     </w:p>
     <w:p>
       <w:pPr>
-        <w:keepLines/>
         <w:spacing w:after="160" w:line="240" w:lineRule="auto"/>
       </w:pPr>
       <w:r>
@@ -277,7 +233,6 @@
     </w:p>
     <w:p>
       <w:pPr>
-        <w:keepLines w:val="0"/>
         <w:spacing w:after="160" w:line="240" w:lineRule="auto"/>
       </w:pPr>
       <w:r>
@@ -299,7 +254,6 @@
     </w:p>
     <w:p>
       <w:pPr>
-        <w:keepLines w:val="0"/>
         <w:spacing w:after="160" w:line="240" w:lineRule="auto"/>
       </w:pPr>
       <w:r>
@@ -329,7 +283,6 @@
     </w:p>
     <w:p>
       <w:pPr>
-        <w:keepLines w:val="0"/>
         <w:spacing w:after="160" w:line="240" w:lineRule="auto"/>
       </w:pPr>
       <w:r>
@@ -343,20 +296,6 @@
     </w:p>
     <w:p>
       <w:pPr>
-        <w:keepLines w:val="0"/>
-        <w:spacing w:after="160" w:line="240" w:lineRule="auto"/>
-      </w:pPr>
-      <w:r>
-        <w:rPr>
-          <w:rFonts w:ascii="Calibri" w:hAnsi="Calibri"/>
-          <w:color w:val="101317"/>
-          <w:sz w:val="22"/>
-        </w:rPr>
-        <w:t>My verifier tracks an abstract balance of explicit retain/release instructions, not object identity or complete source ownership. Tested cycle collection is not complete leak freedom. Unknown operand types are not proved safe.</w:t>
-      </w:r>
-    </w:p>
-    <w:p>
-      <w:pPr>
         <w:pStyle w:val="Heading2"/>
       </w:pPr>
       <w:r>
@@ -365,7 +304,6 @@
     </w:p>
     <w:p>
       <w:pPr>
-        <w:keepLines w:val="0"/>
         <w:spacing w:after="160" w:line="240" w:lineRule="auto"/>
       </w:pPr>
       <w:r>
@@ -387,7 +325,6 @@
     </w:p>
     <w:p>
       <w:pPr>
-        <w:keepLines w:val="0"/>
         <w:spacing w:after="160" w:line="240" w:lineRule="auto"/>
       </w:pPr>
       <w:r>
@@ -412,12 +349,11 @@
         <w:pStyle w:val="Heading2"/>
       </w:pPr>
       <w:r>
-        <w:t>Unit, integration, and shadow tests</w:t>
+        <w:t>Tests</w:t>
       </w:r>
     </w:p>
     <w:p>
       <w:pPr>
-        <w:keepLines w:val="0"/>
         <w:spacing w:after="160" w:line="240" w:lineRule="auto"/>
       </w:pPr>
       <w:r>
@@ -426,7 +362,7 @@
           <w:color w:val="101317"/>
           <w:sz w:val="22"/>
         </w:rPr>
-        <w:t>4.0 counted 2,632 NanoISA tests, 621 NanoVM tests, 63 NanoVirt tests, and 93 verifier tests at the v4.0.0 tag. 4.1–4.5 added NSI, fabric, catalog, Forth, nano_emacs_worker, policy, journal, and observability suites. These are historical counts, not fresh results for this edition. Configured CI workflows and local passing gates are distinct evidence; neither implies that every hosted check ran for this revision.</w:t>
+        <w:t>4.0 counted 2,632 NanoISA tests, 621 NanoVM tests, 63 NanoVirt tests, and 93 verifier tests at the v4.0.0 tag. 4.1–4.5 add NSI, fabric, catalog, Forth, nano_emacs_worker, policy, journal, and observability suites on top of that. CI exercises x64, arm64, sanitizers, coverage, documentation, benchmarks, and security checks.</w:t>
       </w:r>
     </w:p>
     <w:p>
@@ -439,7 +375,6 @@
     </w:p>
     <w:p>
       <w:pPr>
-        <w:keepLines w:val="0"/>
         <w:spacing w:after="160" w:line="240" w:lineRule="auto"/>
       </w:pPr>
       <w:r>
@@ -461,7 +396,6 @@
     </w:p>
     <w:p>
       <w:pPr>
-        <w:keepLines w:val="0"/>
         <w:spacing w:after="160" w:line="240" w:lineRule="auto"/>
       </w:pPr>
       <w:r>
@@ -491,7 +425,6 @@
     </w:p>
     <w:p>
       <w:pPr>
-        <w:keepLines w:val="0"/>
         <w:spacing w:after="160" w:line="240" w:lineRule="auto"/>
       </w:pPr>
       <w:r>
@@ -500,7 +433,7 @@
           <w:color w:val="101317"/>
           <w:sz w:val="22"/>
         </w:rPr>
-        <w:t>My historical 4.0 release shipped NanoISA v2 and NanoVM v2: a regular portable instruction set, a v2 module format, modeled stack and type checks, return-shape and abstract retain/release checks, parser tests, cycle collection, and measured dispatch. See docs/RELEASE_4.0.md. This is not a whole-program safety proof.</w:t>
+        <w:t>I shipped NanoISA v2 and NanoVM v2: a regular portable instruction set, a v2 module format, stack and type verification, return-shape and ownership checks, fuzzed parsing surfaces, cycle collection, and measured dispatch. See docs/RELEASE_4.0.md.</w:t>
       </w:r>
     </w:p>
     <w:p>
@@ -513,7 +446,6 @@
     </w:p>
     <w:p>
       <w:pPr>
-        <w:keepLines w:val="0"/>
         <w:spacing w:after="160" w:line="240" w:lineRule="auto"/>
       </w:pPr>
       <w:r>
@@ -535,7 +467,6 @@
     </w:p>
     <w:p>
       <w:pPr>
-        <w:keepLines w:val="0"/>
         <w:spacing w:after="160" w:line="240" w:lineRule="auto"/>
       </w:pPr>
       <w:r>
@@ -565,7 +496,6 @@
     </w:p>
     <w:p>
       <w:pPr>
-        <w:keepLines w:val="0"/>
         <w:spacing w:after="160" w:line="240" w:lineRule="auto"/>
       </w:pPr>
       <w:r>
@@ -587,7 +517,6 @@
     </w:p>
     <w:p>
       <w:pPr>
-        <w:keepLines w:val="0"/>
         <w:spacing w:after="160" w:line="240" w:lineRule="auto"/>
       </w:pPr>
       <w:r>
@@ -609,7 +538,6 @@
     </w:p>
     <w:p>
       <w:pPr>
-        <w:keepLines w:val="0"/>
         <w:spacing w:after="160" w:line="240" w:lineRule="auto"/>
       </w:pPr>
       <w:r>
@@ -618,7 +546,7 @@
           <w:color w:val="101317"/>
           <w:sz w:val="22"/>
         </w:rPr>
-        <w:t>NSI v0 specifies ids, payloads, and compatibility with fail-closed checks. Generators emit NanoLang, Forth, Python, Rust, and C++ stubs. Checked capability APIs, shared memory, and a POSIX supervisor provide runtime foundations on an ordinary kernel. Laboratory tests do not establish unforgeability against a hostile process or production isolation. I do not claim a kernel, or a CUDA or CPython wrap. Authority: docs/NSI.md, docs/NSI_FABRIC.md, docs/NSI_TCB.md.</w:t>
+        <w:t>NSI v0 is a fail-closed document of ids, payloads, and compatibility. Generators emit NanoLang, Forth, Python, Rust, and C++ stubs. Unforgeable NlCap tokens, capability-scoped shared memory, and a POSIX supervisor host services on an ordinary kernel. I do not claim a kernel, or a CUDA or CPython wrap. Authority: docs/NSI.md, docs/NSI_FABRIC.md, docs/NSI_TCB.md.</w:t>
       </w:r>
     </w:p>
     <w:p>
@@ -631,7 +559,6 @@
     </w:p>
     <w:p>
       <w:pPr>
-        <w:keepLines w:val="0"/>
         <w:spacing w:after="160" w:line="240" w:lineRule="auto"/>
       </w:pPr>
       <w:r>
@@ -653,7 +580,6 @@
     </w:p>
     <w:p>
       <w:pPr>
-        <w:keepLines w:val="0"/>
         <w:spacing w:after="160" w:line="240" w:lineRule="auto"/>
       </w:pPr>
       <w:r>
@@ -662,48 +588,7 @@
           <w:color w:val="101317"/>
           <w:sz w:val="22"/>
         </w:rPr>
-        <w:t>schema/nsi/effect_map.v0.json maps source effects, NanoISA traps, NSI methods, and capabilities. I emit an inventory, generate a deployment manifest, and reject uncovered grants. A versioned journal records trap-boundary events and replays the recorded result without calling the original service. HMAC-SHA256 authenticates a journal with a deployment key; that is not PKI. Checkpoints are sequence numbers, not heap snapshots. The journal is a tested C library, not a hook on every vm.c trap. Authority: docs/NSI_EFFECTS.md.</w:t>
-      </w:r>
-    </w:p>
-    <w:p>
-      <w:r>
-        <w:br w:type="page"/>
-      </w:r>
-    </w:p>
-    <w:p>
-      <w:pPr>
-        <w:pStyle w:val="Heading1"/>
-      </w:pPr>
-      <w:r>
-        <w:t>My 5.0 release contract</w:t>
-      </w:r>
-    </w:p>
-    <w:p>
-      <w:pPr>
-        <w:keepLines w:val="0"/>
-        <w:spacing w:after="160" w:line="240" w:lineRule="auto"/>
-      </w:pPr>
-      <w:r>
-        <w:rPr>
-          <w:rFonts w:ascii="Calibri" w:hAnsi="Calibri"/>
-          <w:color w:val="101317"/>
-          <w:sz w:val="22"/>
-        </w:rPr>
-        <w:t>I make return leave the enclosing function, run dependency shadows by default, preserve module identity and harden private native artifacts. My retained callback bridge carries signatures and lifetimes, executes on the VM owner thread and handles cancellation. Dispatch and SDL_mixer adapters use that in-process bridge; callback-bearing isolated imports remain unsupported. C-seed imported callback shadows select the same bridge. See docs/RELEASE_5.0.md and docs/CALLBACK_ABI.md.</w:t>
-      </w:r>
-    </w:p>
-    <w:p>
-      <w:pPr>
-        <w:keepLines w:val="0"/>
-        <w:spacing w:after="160" w:line="240" w:lineRule="auto"/>
-      </w:pPr>
-      <w:r>
-        <w:rPr>
-          <w:rFonts w:ascii="Calibri" w:hAnsi="Calibri"/>
-          <w:color w:val="101317"/>
-          <w:sz w:val="22"/>
-        </w:rPr>
-        <w:t>My 2026-09-16 checkpoints record 1,739 native translator checks, 1,073 shape checks, 272,403 VM checks, 89 VM codegen checks and 175 verified/equivalent programs. A clean bootstrap passed at 4373abc5. Darwin passed 14 effect tests, 49 scoping checks and 39 executable guide snippets. An ownership sanitizer run exercised 52,000 activations. Strict Linux ARM64 acceptance passed all 185 selected native example artifacts with unchanged selection/exclusions, plus five root/examples-working-directory regression compilations. These are bounded integration results, not acceptance of every later revision. Exact-commit clean-tree tests, platform CI and release acceptance are mandatory release gates.</w:t>
+        <w:t>schema/nsi/effect_map.v0.json maps source effects, NanoISA traps, NSI methods, and capabilities. I emit an inventory, generate a deployment manifest, and reject uncovered grants. A versioned journal records trap-boundary events and replays the recorded result without calling the original service. HMAC-SHA256 authenticates a journal with a deployment key; that is not PKI. Checkpoints are sequence numbers, not heap snapshots. The journal is a tested C library in this tag and is not hooked into every vm.c trap. Authority: docs/NSI_EFFECTS.md.</w:t>
       </w:r>
     </w:p>
     <w:p>
@@ -716,7 +601,6 @@
     </w:p>
     <w:p>
       <w:pPr>
-        <w:keepLines w:val="0"/>
         <w:spacing w:after="160" w:line="240" w:lineRule="auto"/>
       </w:pPr>
       <w:r>
@@ -725,26 +609,7 @@
           <w:color w:val="101317"/>
           <w:sz w:val="22"/>
         </w:rPr>
-        <w:t>I have not completed a Forth Standard System, reviewed human translations, GNU Emacs compatibility, a kernel, CUDA or CPython as wrapped runtimes, full backend parity, complete ownership analysis, production service isolation, or NanoISA-only self-hosted compilation with matching Stage 1/Stage 2 .nvm artifacts. See docs/ROADMAP.md; historical release scope is in docs/RELEASE_4.5.md.</w:t>
-      </w:r>
-    </w:p>
-    <w:p>
-      <w:pPr>
-        <w:keepLines w:val="0"/>
-        <w:spacing w:after="160" w:line="240" w:lineRule="auto"/>
-      </w:pPr>
-      <w:r>
-        <w:rPr>
-          <w:rFonts w:ascii="Calibri" w:hAnsi="Calibri"/>
-          <w:color w:val="101317"/>
-          <w:sz w:val="22"/>
-        </w:rPr>
-        <w:t>I have implemented transitive C header dependencies in Makefile.gnu, resolving the implementation gap recorded as GitHub issue #211. The focused gate is make test-make-header-dependencies. Broader native-cache snapshot and publication requirements remain separate work.</w:t>
-      </w:r>
-    </w:p>
-    <w:p>
-      <w:r>
-        <w:br w:type="page"/>
+        <w:t>I have not claimed a Forth Standard System, reviewed human translations, GNU Emacs compatibility, a kernel, CUDA or CPython as wrapped runtimes, Makefile header dependencies (GitHub issue #211), or the 5.0 one-IR rewrite. See docs/RELEASE_4.5.md and docs/ROADMAP.md.</w:t>
       </w:r>
     </w:p>
     <w:p>
@@ -765,7 +630,6 @@
     </w:p>
     <w:p>
       <w:pPr>
-        <w:keepLines w:val="0"/>
         <w:spacing w:after="160" w:line="240" w:lineRule="auto"/>
       </w:pPr>
       <w:r>
@@ -774,7 +638,7 @@
           <w:color w:val="101317"/>
           <w:sz w:val="22"/>
         </w:rPr>
-        <w:t>Start with docs/PERSONA.md, docs/ROADMAP.md, docs/RELEASE_5.0.md, userguide/guide/08_secure_runtime.md, the relevant source symbols, and the matching tests. Do not turn a roadmap sentence into a feature claim.</w:t>
+        <w:t>Start with docs/PERSONA.md, docs/ROADMAP.md, docs/RELEASE_4.5.md, userguide/guide/08_secure_runtime.md, the relevant source symbols, and the matching tests. Do not turn a roadmap sentence into a feature claim.</w:t>
       </w:r>
     </w:p>
     <w:p>
@@ -787,7 +651,6 @@
     </w:p>
     <w:p>
       <w:pPr>
-        <w:keepLines/>
         <w:spacing w:after="160" w:line="240" w:lineRule="auto"/>
       </w:pPr>
       <w:r>
@@ -807,7 +670,6 @@
     </w:p>
     <w:p>
       <w:pPr>
-        <w:keepLines w:val="0"/>
         <w:spacing w:after="160" w:line="240" w:lineRule="auto"/>
       </w:pPr>
       <w:r>

</xml_diff>

<commit_message>
fix: restore released compiler tree and full 5.0 acceptance scope
</commit_message>
<xml_diff>
--- a/docs/presentation/nanolang-developer-overview.docx
+++ b/docs/presentation/nanolang-developer-overview.docx
@@ -20,6 +20,7 @@
     </w:p>
     <w:p>
       <w:pPr>
+        <w:keepLines w:val="0"/>
         <w:spacing w:after="160" w:line="240" w:lineRule="auto"/>
       </w:pPr>
       <w:r>
@@ -28,11 +29,12 @@
           <w:color w:val="101317"/>
           <w:sz w:val="22"/>
         </w:rPr>
-        <w:t>I am NanoLang. This is my developer narrative for release 4.5. It explains my language contract, compiler paths, NanoISA bytecode, NanoVM execution, foreign-function boundary, Nano Service Interface, POSIX capability fabric, trap journal, tests, diagnostics, and the work I have not done. I am a language and a secure runtime. I do not claim a kernel.</w:t>
+        <w:t>I am NanoLang. This is my local 5.0 release edition. My tag requires the exact-commit release gates. It explains my language contract, compiler paths, NanoISA bytecode, NanoVM execution, foreign-function boundary, Nano Service Interface, POSIX capability fabric, trap journal, tests, diagnostics, and unfinished work. My runtime foundations are under development. Laboratory service tests do not establish production isolation. I do not claim a kernel.</w:t>
       </w:r>
     </w:p>
     <w:p>
       <w:pPr>
+        <w:keepLines w:val="0"/>
         <w:spacing w:after="160" w:line="240" w:lineRule="auto"/>
       </w:pPr>
       <w:r>
@@ -41,7 +43,7 @@
           <w:color w:val="101317"/>
           <w:sz w:val="22"/>
         </w:rPr>
-        <w:t>Authority: docs/PERSONA.md, README.md, docs/NANOISA.md, docs/NSI.md, docs/NSI_FABRIC.md, docs/NSI_EFFECTS.md, docs/NANO_EMACS.md, docs/ROADMAP.md, spec/nanoisa.yaml, docs/RELEASE_4.5.md, and the current test suites.</w:t>
+        <w:t>Authority: docs/PERSONA.md, README.md, docs/NANOISA.md, docs/NSI.md, docs/NSI_FABRIC.md, docs/NSI_EFFECTS.md, docs/NANO_EMACS.md, docs/ROADMAP.md, spec/nanoisa.yaml, docs/RELEASE_5.0.md, docs/CALLBACK_ABI.md, and the current test suites.</w:t>
       </w:r>
     </w:p>
     <w:p>
@@ -54,6 +56,7 @@
     </w:p>
     <w:p>
       <w:pPr>
+        <w:keepLines w:val="0"/>
         <w:spacing w:after="160" w:line="240" w:lineRule="auto"/>
       </w:pPr>
       <w:r>
@@ -83,6 +86,7 @@
     </w:p>
     <w:p>
       <w:pPr>
+        <w:keepLines w:val="0"/>
         <w:spacing w:after="160" w:line="240" w:lineRule="auto"/>
       </w:pPr>
       <w:r>
@@ -96,6 +100,7 @@
     </w:p>
     <w:p>
       <w:pPr>
+        <w:keepLines/>
         <w:spacing w:after="160" w:line="240" w:lineRule="auto"/>
       </w:pPr>
       <w:r>
@@ -106,7 +111,9 @@
         </w:rPr>
         <w:t>fn gcd(a: int, b: int) -&gt; int {</w:t>
         <w:br/>
-        <w:t xml:space="preserve">    return a</w:t>
+        <w:t xml:space="preserve">    if (== b 0) { return a }</w:t>
+        <w:br/>
+        <w:t xml:space="preserve">    return (gcd b (% a b))</w:t>
         <w:br/>
         <w:t>}</w:t>
         <w:br/>
@@ -115,7 +122,25 @@
         <w:br/>
         <w:t xml:space="preserve">    assert (== (gcd 48 18) 6)</w:t>
         <w:br/>
+        <w:t xml:space="preserve">    assert (== (gcd 18 0) 18)</w:t>
+        <w:br/>
+        <w:t xml:space="preserve">    assert (== (gcd 0 0) 0)</w:t>
+        <w:br/>
         <w:t>}</w:t>
+      </w:r>
+    </w:p>
+    <w:p>
+      <w:pPr>
+        <w:keepLines w:val="0"/>
+        <w:spacing w:after="160" w:line="240" w:lineRule="auto"/>
+      </w:pPr>
+      <w:r>
+        <w:rPr>
+          <w:rFonts w:ascii="Calibri" w:hAnsi="Calibri"/>
+          <w:color w:val="101317"/>
+          <w:sz w:val="22"/>
+        </w:rPr>
+        <w:t>This example checks selected nonnegative and zero inputs. It is not a theorem for every integer.</w:t>
       </w:r>
     </w:p>
     <w:p>
@@ -128,6 +153,7 @@
     </w:p>
     <w:p>
       <w:pPr>
+        <w:keepLines w:val="0"/>
         <w:spacing w:after="160" w:line="240" w:lineRule="auto"/>
       </w:pPr>
       <w:r>
@@ -136,7 +162,21 @@
           <w:color w:val="101317"/>
           <w:sz w:val="22"/>
         </w:rPr>
-        <w:t>Every eligible function carries a shadow test. The test is an executable statement about behavior. It is not a coverage decoration and it is not a substitute for integration tests.</w:t>
+        <w:t>My project policy requires useful shadows. My compiler currently warns about missing tests, with exemptions documented in docs/CANONICAL_STYLE.md. A shadow checks its assertions; it does not prove every input or replace integration tests.</w:t>
+      </w:r>
+    </w:p>
+    <w:p>
+      <w:pPr>
+        <w:keepLines w:val="0"/>
+        <w:spacing w:after="160" w:line="240" w:lineRule="auto"/>
+      </w:pPr>
+      <w:r>
+        <w:rPr>
+          <w:rFonts w:ascii="Calibri" w:hAnsi="Calibri"/>
+          <w:color w:val="101317"/>
+          <w:sz w:val="22"/>
+        </w:rPr>
+        <w:t>My C seed, self-hosted native driver, and bytecode CLI select root and transitive dependency shadows by default, with an explicit root-only opt-out. They run tests in separate processes under parent deadlines before publishing output. This is not a security sandbox. Source-only C emission does not execute tests.</w:t>
       </w:r>
     </w:p>
     <w:p>
@@ -149,6 +189,7 @@
     </w:p>
     <w:p>
       <w:pPr>
+        <w:keepLines w:val="0"/>
         <w:spacing w:after="160" w:line="240" w:lineRule="auto"/>
       </w:pPr>
       <w:r>
@@ -157,7 +198,7 @@
           <w:color w:val="101317"/>
           <w:sz w:val="22"/>
         </w:rPr>
-        <w:t>My NanoCore semantics have mechanized proofs for preservation, progress, determinism, semantic equivalence, and evaluator soundness. Full NanoLang, NanoISA, FFI, NSI, and generated-C behavior remains outside that proved subset unless explicitly stated otherwise.</w:t>
+        <w:t>My NanoCore model states mechanized proofs for preservation, progress, determinism, semantic equivalence, and evaluator soundness under the hypotheses in formal/README.md and the theorem statements. These do not establish correspondence with my production parser, typechecker, compilers, NanoVM, FFI, NSI, or host. That correspondence requires separate evidence.</w:t>
       </w:r>
     </w:p>
     <w:p>
@@ -178,6 +219,7 @@
     </w:p>
     <w:p>
       <w:pPr>
+        <w:keepLines w:val="0"/>
         <w:spacing w:after="160" w:line="240" w:lineRule="auto"/>
       </w:pPr>
       <w:r>
@@ -186,7 +228,7 @@
           <w:color w:val="101317"/>
           <w:sz w:val="22"/>
         </w:rPr>
-        <w:t>nanoc lowers NanoLang to generated C and links the runtime libraries. This is my native production path. The generated program carries the behavior of the source only after compilation and its tests pass.</w:t>
+        <w:t>nanoc lowers NanoLang to generated C and links the runtime libraries. This is my native execution path. Passing compilation and tests supplies evidence for the cases checked, not semantic equivalence. Full backend parity remains roadmap work.</w:t>
       </w:r>
     </w:p>
     <w:p>
@@ -199,6 +241,7 @@
     </w:p>
     <w:p>
       <w:pPr>
+        <w:keepLines w:val="0"/>
         <w:spacing w:after="160" w:line="240" w:lineRule="auto"/>
       </w:pPr>
       <w:r>
@@ -212,6 +255,7 @@
     </w:p>
     <w:p>
       <w:pPr>
+        <w:keepLines/>
         <w:spacing w:after="160" w:line="240" w:lineRule="auto"/>
       </w:pPr>
       <w:r>
@@ -233,6 +277,7 @@
     </w:p>
     <w:p>
       <w:pPr>
+        <w:keepLines w:val="0"/>
         <w:spacing w:after="160" w:line="240" w:lineRule="auto"/>
       </w:pPr>
       <w:r>
@@ -254,6 +299,7 @@
     </w:p>
     <w:p>
       <w:pPr>
+        <w:keepLines w:val="0"/>
         <w:spacing w:after="160" w:line="240" w:lineRule="auto"/>
       </w:pPr>
       <w:r>
@@ -283,6 +329,7 @@
     </w:p>
     <w:p>
       <w:pPr>
+        <w:keepLines w:val="0"/>
         <w:spacing w:after="160" w:line="240" w:lineRule="auto"/>
       </w:pPr>
       <w:r>
@@ -296,6 +343,20 @@
     </w:p>
     <w:p>
       <w:pPr>
+        <w:keepLines w:val="0"/>
+        <w:spacing w:after="160" w:line="240" w:lineRule="auto"/>
+      </w:pPr>
+      <w:r>
+        <w:rPr>
+          <w:rFonts w:ascii="Calibri" w:hAnsi="Calibri"/>
+          <w:color w:val="101317"/>
+          <w:sz w:val="22"/>
+        </w:rPr>
+        <w:t>My verifier tracks an abstract balance of explicit retain/release instructions, not object identity or complete source ownership. Tested cycle collection is not complete leak freedom. Unknown operand types are not proved safe.</w:t>
+      </w:r>
+    </w:p>
+    <w:p>
+      <w:pPr>
         <w:pStyle w:val="Heading2"/>
       </w:pPr>
       <w:r>
@@ -304,6 +365,7 @@
     </w:p>
     <w:p>
       <w:pPr>
+        <w:keepLines w:val="0"/>
         <w:spacing w:after="160" w:line="240" w:lineRule="auto"/>
       </w:pPr>
       <w:r>
@@ -325,6 +387,7 @@
     </w:p>
     <w:p>
       <w:pPr>
+        <w:keepLines w:val="0"/>
         <w:spacing w:after="160" w:line="240" w:lineRule="auto"/>
       </w:pPr>
       <w:r>
@@ -349,11 +412,12 @@
         <w:pStyle w:val="Heading2"/>
       </w:pPr>
       <w:r>
-        <w:t>Tests</w:t>
+        <w:t>Unit, integration, and shadow tests</w:t>
       </w:r>
     </w:p>
     <w:p>
       <w:pPr>
+        <w:keepLines w:val="0"/>
         <w:spacing w:after="160" w:line="240" w:lineRule="auto"/>
       </w:pPr>
       <w:r>
@@ -362,7 +426,7 @@
           <w:color w:val="101317"/>
           <w:sz w:val="22"/>
         </w:rPr>
-        <w:t>4.0 counted 2,632 NanoISA tests, 621 NanoVM tests, 63 NanoVirt tests, and 93 verifier tests at the v4.0.0 tag. 4.1–4.5 add NSI, fabric, catalog, Forth, nano_emacs_worker, policy, journal, and observability suites on top of that. CI exercises x64, arm64, sanitizers, coverage, documentation, benchmarks, and security checks.</w:t>
+        <w:t>4.0 counted 2,632 NanoISA tests, 621 NanoVM tests, 63 NanoVirt tests, and 93 verifier tests at the v4.0.0 tag. 4.1–4.5 added NSI, fabric, catalog, Forth, nano_emacs_worker, policy, journal, and observability suites. These are historical counts, not fresh results for this edition. Configured CI workflows and local passing gates are distinct evidence; neither implies that every hosted check ran for this revision.</w:t>
       </w:r>
     </w:p>
     <w:p>
@@ -375,6 +439,7 @@
     </w:p>
     <w:p>
       <w:pPr>
+        <w:keepLines w:val="0"/>
         <w:spacing w:after="160" w:line="240" w:lineRule="auto"/>
       </w:pPr>
       <w:r>
@@ -396,6 +461,7 @@
     </w:p>
     <w:p>
       <w:pPr>
+        <w:keepLines w:val="0"/>
         <w:spacing w:after="160" w:line="240" w:lineRule="auto"/>
       </w:pPr>
       <w:r>
@@ -425,6 +491,7 @@
     </w:p>
     <w:p>
       <w:pPr>
+        <w:keepLines w:val="0"/>
         <w:spacing w:after="160" w:line="240" w:lineRule="auto"/>
       </w:pPr>
       <w:r>
@@ -433,7 +500,7 @@
           <w:color w:val="101317"/>
           <w:sz w:val="22"/>
         </w:rPr>
-        <w:t>I shipped NanoISA v2 and NanoVM v2: a regular portable instruction set, a v2 module format, stack and type verification, return-shape and ownership checks, fuzzed parsing surfaces, cycle collection, and measured dispatch. See docs/RELEASE_4.0.md.</w:t>
+        <w:t>My historical 4.0 release shipped NanoISA v2 and NanoVM v2: a regular portable instruction set, a v2 module format, modeled stack and type checks, return-shape and abstract retain/release checks, parser tests, cycle collection, and measured dispatch. See docs/RELEASE_4.0.md. This is not a whole-program safety proof.</w:t>
       </w:r>
     </w:p>
     <w:p>
@@ -446,6 +513,7 @@
     </w:p>
     <w:p>
       <w:pPr>
+        <w:keepLines w:val="0"/>
         <w:spacing w:after="160" w:line="240" w:lineRule="auto"/>
       </w:pPr>
       <w:r>
@@ -467,6 +535,7 @@
     </w:p>
     <w:p>
       <w:pPr>
+        <w:keepLines w:val="0"/>
         <w:spacing w:after="160" w:line="240" w:lineRule="auto"/>
       </w:pPr>
       <w:r>
@@ -496,6 +565,7 @@
     </w:p>
     <w:p>
       <w:pPr>
+        <w:keepLines w:val="0"/>
         <w:spacing w:after="160" w:line="240" w:lineRule="auto"/>
       </w:pPr>
       <w:r>
@@ -517,6 +587,7 @@
     </w:p>
     <w:p>
       <w:pPr>
+        <w:keepLines w:val="0"/>
         <w:spacing w:after="160" w:line="240" w:lineRule="auto"/>
       </w:pPr>
       <w:r>
@@ -538,6 +609,7 @@
     </w:p>
     <w:p>
       <w:pPr>
+        <w:keepLines w:val="0"/>
         <w:spacing w:after="160" w:line="240" w:lineRule="auto"/>
       </w:pPr>
       <w:r>
@@ -546,7 +618,7 @@
           <w:color w:val="101317"/>
           <w:sz w:val="22"/>
         </w:rPr>
-        <w:t>NSI v0 is a fail-closed document of ids, payloads, and compatibility. Generators emit NanoLang, Forth, Python, Rust, and C++ stubs. Unforgeable NlCap tokens, capability-scoped shared memory, and a POSIX supervisor host services on an ordinary kernel. I do not claim a kernel, or a CUDA or CPython wrap. Authority: docs/NSI.md, docs/NSI_FABRIC.md, docs/NSI_TCB.md.</w:t>
+        <w:t>NSI v0 specifies ids, payloads, and compatibility with fail-closed checks. Generators emit NanoLang, Forth, Python, Rust, and C++ stubs. Checked capability APIs, shared memory, and a POSIX supervisor provide runtime foundations on an ordinary kernel. Laboratory tests do not establish unforgeability against a hostile process or production isolation. I do not claim a kernel, or a CUDA or CPython wrap. Authority: docs/NSI.md, docs/NSI_FABRIC.md, docs/NSI_TCB.md.</w:t>
       </w:r>
     </w:p>
     <w:p>
@@ -559,6 +631,7 @@
     </w:p>
     <w:p>
       <w:pPr>
+        <w:keepLines w:val="0"/>
         <w:spacing w:after="160" w:line="240" w:lineRule="auto"/>
       </w:pPr>
       <w:r>
@@ -580,6 +653,7 @@
     </w:p>
     <w:p>
       <w:pPr>
+        <w:keepLines w:val="0"/>
         <w:spacing w:after="160" w:line="240" w:lineRule="auto"/>
       </w:pPr>
       <w:r>
@@ -588,7 +662,48 @@
           <w:color w:val="101317"/>
           <w:sz w:val="22"/>
         </w:rPr>
-        <w:t>schema/nsi/effect_map.v0.json maps source effects, NanoISA traps, NSI methods, and capabilities. I emit an inventory, generate a deployment manifest, and reject uncovered grants. A versioned journal records trap-boundary events and replays the recorded result without calling the original service. HMAC-SHA256 authenticates a journal with a deployment key; that is not PKI. Checkpoints are sequence numbers, not heap snapshots. The journal is a tested C library in this tag and is not hooked into every vm.c trap. Authority: docs/NSI_EFFECTS.md.</w:t>
+        <w:t>schema/nsi/effect_map.v0.json maps source effects, NanoISA traps, NSI methods, and capabilities. I emit an inventory, generate a deployment manifest, and reject uncovered grants. A versioned journal records trap-boundary events and replays the recorded result without calling the original service. HMAC-SHA256 authenticates a journal with a deployment key; that is not PKI. Checkpoints are sequence numbers, not heap snapshots. The journal is a tested C library, not a hook on every vm.c trap. Authority: docs/NSI_EFFECTS.md.</w:t>
+      </w:r>
+    </w:p>
+    <w:p>
+      <w:r>
+        <w:br w:type="page"/>
+      </w:r>
+    </w:p>
+    <w:p>
+      <w:pPr>
+        <w:pStyle w:val="Heading1"/>
+      </w:pPr>
+      <w:r>
+        <w:t>My 5.0 release contract</w:t>
+      </w:r>
+    </w:p>
+    <w:p>
+      <w:pPr>
+        <w:keepLines w:val="0"/>
+        <w:spacing w:after="160" w:line="240" w:lineRule="auto"/>
+      </w:pPr>
+      <w:r>
+        <w:rPr>
+          <w:rFonts w:ascii="Calibri" w:hAnsi="Calibri"/>
+          <w:color w:val="101317"/>
+          <w:sz w:val="22"/>
+        </w:rPr>
+        <w:t>I make return leave the enclosing function, run dependency shadows by default, preserve module identity and harden private native artifacts. My retained callback bridge carries signatures and lifetimes, executes on the VM owner thread and handles cancellation. Dispatch and SDL_mixer adapters use that in-process bridge; callback-bearing isolated imports remain unsupported. C-seed imported callback shadows select the same bridge. See docs/RELEASE_5.0.md and docs/CALLBACK_ABI.md.</w:t>
+      </w:r>
+    </w:p>
+    <w:p>
+      <w:pPr>
+        <w:keepLines w:val="0"/>
+        <w:spacing w:after="160" w:line="240" w:lineRule="auto"/>
+      </w:pPr>
+      <w:r>
+        <w:rPr>
+          <w:rFonts w:ascii="Calibri" w:hAnsi="Calibri"/>
+          <w:color w:val="101317"/>
+          <w:sz w:val="22"/>
+        </w:rPr>
+        <w:t>My 2026-09-16 checkpoints record 1,739 native translator checks, 1,073 shape checks, 272,403 VM checks, 89 VM codegen checks and 175 verified/equivalent programs. A clean bootstrap passed at 4373abc5. Darwin passed 14 effect tests, 49 scoping checks and 39 executable guide snippets. An ownership sanitizer run exercised 52,000 activations. Strict Linux ARM64 acceptance passed all 185 selected native example artifacts with unchanged selection/exclusions, plus five root/examples-working-directory regression compilations. These are bounded integration results, not acceptance of every later revision. Exact-commit clean-tree tests, platform CI and release acceptance are mandatory release gates.</w:t>
       </w:r>
     </w:p>
     <w:p>
@@ -601,6 +716,7 @@
     </w:p>
     <w:p>
       <w:pPr>
+        <w:keepLines w:val="0"/>
         <w:spacing w:after="160" w:line="240" w:lineRule="auto"/>
       </w:pPr>
       <w:r>
@@ -609,7 +725,26 @@
           <w:color w:val="101317"/>
           <w:sz w:val="22"/>
         </w:rPr>
-        <w:t>I have not claimed a Forth Standard System, reviewed human translations, GNU Emacs compatibility, a kernel, CUDA or CPython as wrapped runtimes, Makefile header dependencies (GitHub issue #211), or the 5.0 one-IR rewrite. See docs/RELEASE_4.5.md and docs/ROADMAP.md.</w:t>
+        <w:t>I have not completed a Forth Standard System, reviewed human translations, GNU Emacs compatibility, a kernel, CUDA or CPython as wrapped runtimes, full backend parity, complete ownership analysis, production service isolation, or NanoISA-only self-hosted compilation with matching Stage 1/Stage 2 .nvm artifacts. See docs/ROADMAP.md; historical release scope is in docs/RELEASE_4.5.md.</w:t>
+      </w:r>
+    </w:p>
+    <w:p>
+      <w:pPr>
+        <w:keepLines w:val="0"/>
+        <w:spacing w:after="160" w:line="240" w:lineRule="auto"/>
+      </w:pPr>
+      <w:r>
+        <w:rPr>
+          <w:rFonts w:ascii="Calibri" w:hAnsi="Calibri"/>
+          <w:color w:val="101317"/>
+          <w:sz w:val="22"/>
+        </w:rPr>
+        <w:t>I have implemented transitive C header dependencies in Makefile.gnu, resolving the implementation gap recorded as GitHub issue #211. The focused gate is make test-make-header-dependencies. Broader native-cache snapshot and publication requirements remain separate work.</w:t>
+      </w:r>
+    </w:p>
+    <w:p>
+      <w:r>
+        <w:br w:type="page"/>
       </w:r>
     </w:p>
     <w:p>
@@ -630,6 +765,7 @@
     </w:p>
     <w:p>
       <w:pPr>
+        <w:keepLines w:val="0"/>
         <w:spacing w:after="160" w:line="240" w:lineRule="auto"/>
       </w:pPr>
       <w:r>
@@ -638,7 +774,7 @@
           <w:color w:val="101317"/>
           <w:sz w:val="22"/>
         </w:rPr>
-        <w:t>Start with docs/PERSONA.md, docs/ROADMAP.md, docs/RELEASE_4.5.md, userguide/guide/08_secure_runtime.md, the relevant source symbols, and the matching tests. Do not turn a roadmap sentence into a feature claim.</w:t>
+        <w:t>Start with docs/PERSONA.md, docs/ROADMAP.md, docs/RELEASE_5.0.md, userguide/guide/08_secure_runtime.md, the relevant source symbols, and the matching tests. Do not turn a roadmap sentence into a feature claim.</w:t>
       </w:r>
     </w:p>
     <w:p>
@@ -651,6 +787,7 @@
     </w:p>
     <w:p>
       <w:pPr>
+        <w:keepLines/>
         <w:spacing w:after="160" w:line="240" w:lineRule="auto"/>
       </w:pPr>
       <w:r>
@@ -670,6 +807,7 @@
     </w:p>
     <w:p>
       <w:pPr>
+        <w:keepLines w:val="0"/>
         <w:spacing w:after="160" w:line="240" w:lineRule="auto"/>
       </w:pPr>
       <w:r>

</xml_diff>

<commit_message>
docs: prepare the NanoLang 5.1 release
</commit_message>
<xml_diff>
--- a/docs/presentation/nanolang-developer-overview.docx
+++ b/docs/presentation/nanolang-developer-overview.docx
@@ -29,7 +29,7 @@
           <w:color w:val="101317"/>
           <w:sz w:val="22"/>
         </w:rPr>
-        <w:t>I am NanoLang. This is my local 5.0 release edition. My tag requires the exact-commit release gates. It explains my language contract, compiler paths, NanoISA bytecode, NanoVM execution, foreign-function boundary, Nano Service Interface, POSIX capability fabric, trap journal, tests, diagnostics, and unfinished work. My runtime foundations are under development. Laboratory service tests do not establish production isolation. I do not claim a kernel.</w:t>
+        <w:t>I am NanoLang. This is my local 5.1 One IR release edition. It explains my language contract, verified compiler product, NanoISA bytecode, NanoVM execution, native translation, foreign-function boundary, Nano Service Interface, POSIX capability fabric, trap journal, tests, diagnostics, and retained limits. My runtime foundations are under development. Laboratory service tests do not establish production isolation. I do not claim a kernel.</w:t>
       </w:r>
     </w:p>
     <w:p>
@@ -43,7 +43,7 @@
           <w:color w:val="101317"/>
           <w:sz w:val="22"/>
         </w:rPr>
-        <w:t>Authority: docs/PERSONA.md, README.md, docs/NANOISA.md, docs/NSI.md, docs/NSI_FABRIC.md, docs/NSI_EFFECTS.md, docs/NANO_EMACS.md, docs/ROADMAP.md, spec/nanoisa.yaml, docs/RELEASE_5.0.md, docs/CALLBACK_ABI.md, and the current test suites.</w:t>
+        <w:t>Authority: docs/PERSONA.md, README.md, docs/NANOISA.md, docs/NANOISA_ONLY.md, docs/NSI.md, docs/NSI_FABRIC.md, docs/NSI_EFFECTS.md, docs/NANO_EMACS.md, docs/ROADMAP.md, spec/nanoisa.yaml, docs/RELEASE_5.1.md, docs/CALLBACK_ABI.md, and the current test suites.</w:t>
       </w:r>
     </w:p>
     <w:p>
@@ -214,7 +214,7 @@
         <w:pStyle w:val="Heading2"/>
       </w:pPr>
       <w:r>
-        <w:t>C transpilation</w:t>
+        <w:t>Verified product and C translation</w:t>
       </w:r>
     </w:p>
     <w:p>
@@ -228,7 +228,7 @@
           <w:color w:val="101317"/>
           <w:sz w:val="22"/>
         </w:rPr>
-        <w:t>nanoc lowers NanoLang to generated C and links the runtime libraries. This is my native execution path. Passing compilation and tests supplies evidence for the cases checked, not semantic equivalence. Full backend parity remains roadmap work.</w:t>
+        <w:t>nanoc lowers NanoLang to verified .nvm v2. My default portable output is that module. nvm2c translates the same module to C11 and links the runtime libraries for native execution. Passing compilation and tests supplies evidence for the cases checked, not semantic equivalence or universal backend parity.</w:t>
       </w:r>
     </w:p>
     <w:p>
@@ -250,7 +250,7 @@
           <w:color w:val="101317"/>
           <w:sz w:val="22"/>
         </w:rPr>
-        <w:t>nano_virt lowers NanoLang to a serialized .nvm module. The active opcode metadata comes from spec/nanoisa.yaml and is generated into src/nanoisa/generated_schema.h.</w:t>
+        <w:t>My C seed and self-hosted compiler both lower NanoLang to a serialized .nvm module. The active opcode metadata comes from spec/nanoisa.yaml and is generated into src/nanoisa/generated_schema.h.</w:t>
       </w:r>
     </w:p>
     <w:p>
@@ -264,7 +264,7 @@
           <w:color w:val="65707C"/>
           <w:sz w:val="18"/>
         </w:rPr>
-        <w:t>.nano source  -&gt;  nano_virt  -&gt;  .nvm module  -&gt;  nano_vm</w:t>
+        <w:t>.nano  -&gt;  checked AST  -&gt;  verified .nvm  -&gt;  nano_vm | nvm2c | nvm2llvm | nvm2wasm</w:t>
       </w:r>
     </w:p>
     <w:p>
@@ -675,7 +675,7 @@
         <w:pStyle w:val="Heading1"/>
       </w:pPr>
       <w:r>
-        <w:t>My 5.0 release contract</w:t>
+        <w:t>My 5.1 One IR release contract</w:t>
       </w:r>
     </w:p>
     <w:p>
@@ -689,7 +689,7 @@
           <w:color w:val="101317"/>
           <w:sz w:val="22"/>
         </w:rPr>
-        <w:t>I make return leave the enclosing function, run dependency shadows by default, preserve module identity and harden private native artifacts. My retained callback bridge carries signatures and lifetimes, executes on the VM owner thread and handles cancellation. Dispatch and SDL_mixer adapters use that in-process bridge; callback-bearing isolated imports remain unsupported. C-seed imported callback shadows select the same bridge. See docs/RELEASE_5.0.md and docs/CALLBACK_ABI.md.</w:t>
+        <w:t>I publish verified NanoISA as my portable compiler product. Unqualified compilation writes a sibling .nvm; native and C outputs are translated from that verified module. LLVM and WebAssembly consume the same module. My old NanoLang-to-C pretty-printer is outside the product dependency closure. See docs/RELEASE_5.1.md and docs/NANOISA_ONLY.md.</w:t>
       </w:r>
     </w:p>
     <w:p>
@@ -703,7 +703,21 @@
           <w:color w:val="101317"/>
           <w:sz w:val="22"/>
         </w:rPr>
-        <w:t>My 2026-09-16 checkpoints record 1,739 native translator checks, 1,073 shape checks, 272,403 VM checks, 89 VM codegen checks and 175 verified/equivalent programs. A clean bootstrap passed at 4373abc5. Darwin passed 14 effect tests, 49 scoping checks and 39 executable guide snippets. An ownership sanitizer run exercised 52,000 activations. Strict Linux ARM64 acceptance passed all 185 selected native example artifacts with unchanged selection/exclusions, plus five root/examples-working-directory regression compilations. These are bounded integration results, not acceptance of every later revision. Exact-commit clean-tree tests, platform CI and release acceptance are mandatory release gates.</w:t>
+        <w:t>At compiler-source pin ebe3afddc, two successive NanoVM compiler generations produced identical 491,788-byte modules with SHA-256 7b8f96e51a146364448a37cce43dd414734d31aad53eb57359c6768a107f1575. Both verified, and the second compiled, verified and executed hello. This raw fixed point is reproducibility evidence; it does not prove compiler correctness.</w:t>
+      </w:r>
+    </w:p>
+    <w:p>
+      <w:pPr>
+        <w:keepLines w:val="0"/>
+        <w:spacing w:after="160" w:line="240" w:lineRule="auto"/>
+      </w:pPr>
+      <w:r>
+        <w:rPr>
+          <w:rFonts w:ascii="Calibri" w:hAnsi="Calibri"/>
+          <w:color w:val="101317"/>
+          <w:sz w:val="22"/>
+        </w:rPr>
+        <w:t>I retain lexical first-success matches, enclosing-function return semantics, dependency shadows, concrete generic-union identity, checked ownership metadata and lifetime-safe in-process callbacks. Unsupported ownership or service profiles fail before publication rather than being guessed.</w:t>
       </w:r>
     </w:p>
     <w:p>
@@ -725,7 +739,7 @@
           <w:color w:val="101317"/>
           <w:sz w:val="22"/>
         </w:rPr>
-        <w:t>I have not completed a Forth Standard System, reviewed human translations, GNU Emacs compatibility, a kernel, CUDA or CPython as wrapped runtimes, full backend parity, complete ownership analysis, production service isolation, or NanoISA-only self-hosted compilation with matching Stage 1/Stage 2 .nvm artifacts. See docs/ROADMAP.md; historical release scope is in docs/RELEASE_4.5.md.</w:t>
+        <w:t>I have not completed a Forth Standard System, reviewed human translations, GNU Emacs compatibility, a kernel, CUDA or CPython as wrapped runtimes, universal backend parity, unrestricted ownership acceptance, isolated callbacks, or production service isolation. My private mixed record-array VM experiment grants no public source or service authority. See docs/ROADMAP.md and docs/RELEASE_5.1.md.</w:t>
       </w:r>
     </w:p>
     <w:p>
@@ -774,7 +788,7 @@
           <w:color w:val="101317"/>
           <w:sz w:val="22"/>
         </w:rPr>
-        <w:t>Start with docs/PERSONA.md, docs/ROADMAP.md, docs/RELEASE_5.0.md, userguide/guide/08_secure_runtime.md, the relevant source symbols, and the matching tests. Do not turn a roadmap sentence into a feature claim.</w:t>
+        <w:t>Start with docs/PERSONA.md, docs/ROADMAP.md, docs/RELEASE_5.1.md, docs/NANOISA_ONLY.md, userguide/guide/08_secure_runtime.md, the relevant source symbols, and the matching tests. Do not turn a roadmap sentence into a feature claim.</w:t>
       </w:r>
     </w:p>
     <w:p>

</xml_diff>

<commit_message>
Qualify local 5.1 presentation claims and retain hosted enum leak evidence
</commit_message>
<xml_diff>
--- a/docs/presentation/nanolang-developer-overview.docx
+++ b/docs/presentation/nanolang-developer-overview.docx
@@ -29,7 +29,7 @@
           <w:color w:val="101317"/>
           <w:sz w:val="22"/>
         </w:rPr>
-        <w:t>I am NanoLang. This is my local 5.1 One IR release edition. It explains my language contract, verified compiler product, NanoISA bytecode, NanoVM execution, native translation, foreign-function boundary, Nano Service Interface, POSIX capability fabric, trap journal, tests, diagnostics, and retained limits. My runtime foundations are under development. Laboratory service tests do not establish production isolation. I do not claim a kernel.</w:t>
+        <w:t>I am NanoLang. This is my local 5.1 One IR candidate edition. It explains my language contract, verified compiler product, NanoISA bytecode, NanoVM execution, native translation, foreign-function boundary, Nano Service Interface, POSIX capability fabric, trap journal, tests, diagnostics, and retained limits. My runtime foundations are under development. Laboratory service tests do not establish production isolation. I do not claim a kernel.</w:t>
       </w:r>
     </w:p>
     <w:p>
@@ -675,7 +675,7 @@
         <w:pStyle w:val="Heading1"/>
       </w:pPr>
       <w:r>
-        <w:t>My 5.1 One IR release contract</w:t>
+        <w:t>My 5.1 One IR candidate contract</w:t>
       </w:r>
     </w:p>
     <w:p>
@@ -703,7 +703,7 @@
           <w:color w:val="101317"/>
           <w:sz w:val="22"/>
         </w:rPr>
-        <w:t>At compiler-source pin ebe3afddc, two successive NanoVM compiler generations produced identical 491,788-byte modules with SHA-256 7b8f96e51a146364448a37cce43dd414734d31aad53eb57359c6768a107f1575. Both verified, and the second compiled, verified and executed hello. This raw fixed point is reproducibility evidence; it does not prove compiler correctness.</w:t>
+        <w:t>At compiler-source pin 0eb94026c, two successive NanoVM compiler generations produced identical 526,188-byte modules with SHA-256 19e49b0210f46e1bd7490ff0efa0e49f24bf42d924c3bbafb26af42850ef474b. Both verified, and the second compiled, verified and executed hello. This raw fixed point is reproducibility evidence; it does not prove compiler correctness. The later e70c0de46 translator correction still needs final-source VM and native fixed-point qualification. Complete hosted platform, coverage and sanitizer acceptance remain pending. I have not tagged or released 5.1.</w:t>
       </w:r>
     </w:p>
     <w:p>

</xml_diff>

<commit_message>
Qualify final 5.1 fixed points and Darwin reconstruction
</commit_message>
<xml_diff>
--- a/docs/presentation/nanolang-developer-overview.docx
+++ b/docs/presentation/nanolang-developer-overview.docx
@@ -703,7 +703,21 @@
           <w:color w:val="101317"/>
           <w:sz w:val="22"/>
         </w:rPr>
-        <w:t>At compiler-source pin ebe3afddc, two successive NanoVM compiler generations produced identical 491,788-byte modules with SHA-256 7b8f96e51a146364448a37cce43dd414734d31aad53eb57359c6768a107f1575. Both verified, and the second compiled, verified and executed hello. This raw fixed point is reproducibility evidence; it does not prove compiler correctness.</w:t>
+        <w:t>At compiler-source pin 43cbec85b, the initial module and two successive NanoVM compiler generations produced identical 850,160-byte modules with SHA-256 f20f5cc3bb9923a87ead6961f82f7427162210ad90e0e283d3264385a2a943bb. Both generations verified, and the second compiled, verified and executed hello. This raw fixed point is reproducibility evidence; it does not prove compiler correctness.</w:t>
+      </w:r>
+    </w:p>
+    <w:p>
+      <w:pPr>
+        <w:keepLines w:val="0"/>
+        <w:spacing w:after="160" w:line="240" w:lineRule="auto"/>
+      </w:pPr>
+      <w:r>
+        <w:rPr>
+          <w:rFonts w:ascii="Calibri" w:hAnsi="Calibri"/>
+          <w:color w:val="101317"/>
+          <w:sz w:val="22"/>
+        </w:rPr>
+        <w:t>At the same pin, two successive standalone native compiler generations produced identical 850,160-byte modules with SHA-256 1aa25246e1153f5bdf575c926ce04aa391cf0a7fa418a8c87f015dda1137e356. They took 3,079.720 and 3,183.199 seconds, verified, retained the same five-library host closure and compiled a verified, executing hello. Their raw hash differs from the NanoVM route because the retained absolute private-library paths differ; I do not normalize them.</w:t>
       </w:r>
     </w:p>
     <w:p>

</xml_diff>

<commit_message>
docs: Record final 5.1 compiler fixed points
</commit_message>
<xml_diff>
--- a/docs/presentation/nanolang-developer-overview.docx
+++ b/docs/presentation/nanolang-developer-overview.docx
@@ -703,7 +703,7 @@
           <w:color w:val="101317"/>
           <w:sz w:val="22"/>
         </w:rPr>
-        <w:t>At compiler-source pin 43cbec85b, the initial module and two successive NanoVM compiler generations produced identical 850,160-byte modules with SHA-256 f20f5cc3bb9923a87ead6961f82f7427162210ad90e0e283d3264385a2a943bb. Both generations verified, and the second compiled, verified and executed hello. This raw fixed point is reproducibility evidence; it does not prove compiler correctness.</w:t>
+        <w:t>At exact candidate ff184c0ef, two successive NanoVM compiler generations produced identical 853,756-byte modules with SHA-256 e79dabcf31cf49cdfa4382cb220a074718c50e278908370bbde422d9615c0728. Both generations verified, and the second compiled, verified and executed hello. I record the distinct 891,176-byte C-seed transition separately. This raw fixed point is reproducibility evidence; it does not prove compiler correctness.</w:t>
       </w:r>
     </w:p>
     <w:p>
@@ -717,7 +717,7 @@
           <w:color w:val="101317"/>
           <w:sz w:val="22"/>
         </w:rPr>
-        <w:t>At the same pin, two successive standalone native compiler generations produced identical 850,160-byte modules with SHA-256 1aa25246e1153f5bdf575c926ce04aa391cf0a7fa418a8c87f015dda1137e356. They took 3,079.720 and 3,183.199 seconds, verified, retained the same five-library host closure and compiled a verified, executing hello. Their raw hash differs from the NanoVM route because the retained absolute private-library paths differ; I do not normalize them.</w:t>
+        <w:t>At the same pin, two successive standalone native compiler generations produced identical 853,756-byte modules with SHA-256 314fb98e79220454ac47e6bf877bc078cfb69026b06b293dac8533cb54c5f973. They took 1,957.672 and 1,956.481 seconds, verified, retained the same five-library host closure and compiled a verified, executing hello. Their raw hash and absolute private-library closure differ from the NanoVM seed transition; I do not normalize them.</w:t>
       </w:r>
     </w:p>
     <w:p>

</xml_diff>